<commit_message>
Cas contrat de mariage et sources multiples
</commit_message>
<xml_diff>
--- a/doc/NotesNRa4_tests.docx
+++ b/doc/NotesNRa4_tests.docx
@@ -598,6 +598,82 @@
         <w:t>/*.log</w:t>
       </w:r>
     </w:p>
+    <w:p>
+      <w:pPr>
+        <w:autoSpaceDE w:val="0"/>
+        <w:autoSpaceDN w:val="0"/>
+        <w:adjustRightInd w:val="0"/>
+        <w:rPr>
+          <w:rFonts w:ascii="Lucida Console" w:hAnsi="Lucida Console" w:cs="Lucida Console"/>
+          <w:kern w:val="0"/>
+          <w:sz w:val="18"/>
+          <w:szCs w:val="18"/>
+        </w:rPr>
+      </w:pPr>
+      <w:proofErr w:type="spellStart"/>
+      <w:proofErr w:type="gramStart"/>
+      <w:r>
+        <w:rPr>
+          <w:rFonts w:ascii="Lucida Console" w:hAnsi="Lucida Console" w:cs="Lucida Console"/>
+          <w:kern w:val="0"/>
+          <w:sz w:val="18"/>
+          <w:szCs w:val="18"/>
+        </w:rPr>
+        <w:t>egrep</w:t>
+      </w:r>
+      <w:proofErr w:type="spellEnd"/>
+      <w:proofErr w:type="gramEnd"/>
+      <w:r>
+        <w:rPr>
+          <w:rFonts w:ascii="Lucida Console" w:hAnsi="Lucida Console" w:cs="Lucida Console"/>
+          <w:kern w:val="0"/>
+          <w:sz w:val="18"/>
+          <w:szCs w:val="18"/>
+        </w:rPr>
+        <w:t xml:space="preserve"> '</w:t>
+      </w:r>
+      <w:proofErr w:type="spellStart"/>
+      <w:r>
+        <w:rPr>
+          <w:rFonts w:ascii="Lucida Console" w:hAnsi="Lucida Console" w:cs="Lucida Console"/>
+          <w:kern w:val="0"/>
+          <w:sz w:val="18"/>
+          <w:szCs w:val="18"/>
+        </w:rPr>
+        <w:t>Traceback|ERROR</w:t>
+      </w:r>
+      <w:proofErr w:type="spellEnd"/>
+      <w:r>
+        <w:rPr>
+          <w:rFonts w:ascii="Lucida Console" w:hAnsi="Lucida Console" w:cs="Lucida Console"/>
+          <w:kern w:val="0"/>
+          <w:sz w:val="18"/>
+          <w:szCs w:val="18"/>
+        </w:rPr>
+        <w:t xml:space="preserve">' </w:t>
+      </w:r>
+      <w:proofErr w:type="spellStart"/>
+      <w:r>
+        <w:rPr>
+          <w:rFonts w:ascii="Lucida Console" w:hAnsi="Lucida Console" w:cs="Lucida Console"/>
+          <w:kern w:val="0"/>
+          <w:sz w:val="18"/>
+          <w:szCs w:val="18"/>
+        </w:rPr>
+        <w:t>result</w:t>
+      </w:r>
+      <w:proofErr w:type="spellEnd"/>
+      <w:r>
+        <w:rPr>
+          <w:rFonts w:ascii="Lucida Console" w:hAnsi="Lucida Console" w:cs="Lucida Console"/>
+          <w:kern w:val="0"/>
+          <w:sz w:val="18"/>
+          <w:szCs w:val="18"/>
+        </w:rPr>
+        <w:t>/*.log</w:t>
+      </w:r>
+    </w:p>
+    <w:p/>
     <w:p/>
     <w:p>
       <w:proofErr w:type="spellStart"/>
@@ -747,6 +823,7 @@
           <w:rFonts w:eastAsiaTheme="majorEastAsia"/>
           <w:highlight w:val="cyan"/>
         </w:rPr>
+        <w:lastRenderedPageBreak/>
         <w:t>scrapy</w:t>
       </w:r>
       <w:proofErr w:type="spellEnd"/>
@@ -811,7 +888,6 @@
           <w:rFonts w:eastAsiaTheme="majorEastAsia"/>
           <w:highlight w:val="cyan"/>
         </w:rPr>
-        <w:lastRenderedPageBreak/>
         <w:t>scrapy</w:t>
       </w:r>
       <w:proofErr w:type="spellEnd"/>

</xml_diff>

<commit_message>
Gestion titre de noblesse
</commit_message>
<xml_diff>
--- a/doc/NotesNRa4_tests.docx
+++ b/doc/NotesNRa4_tests.docx
@@ -1737,6 +1737,2387 @@
     <w:p/>
     <w:p/>
     <w:p>
+      <w:r>
+        <w:t>Notes</w:t>
+      </w:r>
+    </w:p>
+    <w:p>
+      <w:pPr>
+        <w:rPr>
+          <w:rStyle w:val="Lienhypertexte"/>
+        </w:rPr>
+      </w:pPr>
+      <w:hyperlink r:id="rId8" w:history="1">
+        <w:r>
+          <w:rPr>
+            <w:rStyle w:val="Lienhypertexte"/>
+          </w:rPr>
+          <w:t>file:///D:/Users/Nicolas/Documents/Python/geneanet/result/pages/gw.geneanet.org.nraibaut2.lang=fr.p=pierre.n=dupont.html</w:t>
+        </w:r>
+      </w:hyperlink>
+    </w:p>
+    <w:bookmarkStart w:id="0" w:name="_Hlk143032551"/>
+    <w:p>
+      <w:r>
+        <w:fldChar w:fldCharType="begin"/>
+      </w:r>
+      <w:r>
+        <w:instrText>HYPERLINK "</w:instrText>
+      </w:r>
+      <w:r>
+        <w:instrText>https://gw.geneanet.org/nraibaut2?lang=fr&amp;p=pierre&amp;n=dupont</w:instrText>
+      </w:r>
+      <w:r>
+        <w:instrText>"</w:instrText>
+      </w:r>
+      <w:r>
+        <w:fldChar w:fldCharType="separate"/>
+      </w:r>
+      <w:r>
+        <w:rPr>
+          <w:rStyle w:val="Lienhypertexte"/>
+        </w:rPr>
+        <w:t>https://gw.geneanet.org/nraibaut2?lang=fr&amp;p=pierre&amp;n=dupont</w:t>
+      </w:r>
+      <w:r>
+        <w:fldChar w:fldCharType="end"/>
+      </w:r>
+    </w:p>
+    <w:bookmarkEnd w:id="0"/>
+    <w:p/>
+    <w:p>
+      <w:r>
+        <w:rPr>
+          <w:noProof/>
+        </w:rPr>
+        <w:lastRenderedPageBreak/>
+        <w:drawing>
+          <wp:inline distT="0" distB="0" distL="0" distR="0" wp14:anchorId="1AB230D8" wp14:editId="41089AAC">
+            <wp:extent cx="1739609" cy="1816925"/>
+            <wp:effectExtent l="0" t="0" r="0" b="0"/>
+            <wp:docPr id="1198804864" name="Image 1"/>
+            <wp:cNvGraphicFramePr>
+              <a:graphicFrameLocks xmlns:a="http://schemas.openxmlformats.org/drawingml/2006/main" noChangeAspect="1"/>
+            </wp:cNvGraphicFramePr>
+            <a:graphic xmlns:a="http://schemas.openxmlformats.org/drawingml/2006/main">
+              <a:graphicData uri="http://schemas.openxmlformats.org/drawingml/2006/picture">
+                <pic:pic xmlns:pic="http://schemas.openxmlformats.org/drawingml/2006/picture">
+                  <pic:nvPicPr>
+                    <pic:cNvPr id="1198804864" name=""/>
+                    <pic:cNvPicPr/>
+                  </pic:nvPicPr>
+                  <pic:blipFill>
+                    <a:blip r:embed="rId9"/>
+                    <a:stretch>
+                      <a:fillRect/>
+                    </a:stretch>
+                  </pic:blipFill>
+                  <pic:spPr>
+                    <a:xfrm>
+                      <a:off x="0" y="0"/>
+                      <a:ext cx="1749259" cy="1827004"/>
+                    </a:xfrm>
+                    <a:prstGeom prst="rect">
+                      <a:avLst/>
+                    </a:prstGeom>
+                  </pic:spPr>
+                </pic:pic>
+              </a:graphicData>
+            </a:graphic>
+          </wp:inline>
+        </w:drawing>
+      </w:r>
+    </w:p>
+    <w:p>
+      <w:pPr>
+        <w:pStyle w:val="Listing"/>
+      </w:pPr>
+      <w:proofErr w:type="gramStart"/>
+      <w:r>
+        <w:t>&lt;!--</w:t>
+      </w:r>
+      <w:proofErr w:type="gramEnd"/>
+      <w:r>
+        <w:t xml:space="preserve"> notes --&gt;</w:t>
+      </w:r>
+    </w:p>
+    <w:p>
+      <w:pPr>
+        <w:pStyle w:val="Listing"/>
+      </w:pPr>
+      <w:r>
+        <w:t>&lt;</w:t>
+      </w:r>
+      <w:proofErr w:type="gramStart"/>
+      <w:r>
+        <w:t>a</w:t>
+      </w:r>
+      <w:proofErr w:type="gramEnd"/>
+      <w:r>
+        <w:t xml:space="preserve"> </w:t>
+      </w:r>
+      <w:proofErr w:type="spellStart"/>
+      <w:r>
+        <w:t>name</w:t>
+      </w:r>
+      <w:proofErr w:type="spellEnd"/>
+      <w:r>
+        <w:t>="notes"&gt;&lt;/a&gt;</w:t>
+      </w:r>
+    </w:p>
+    <w:p>
+      <w:pPr>
+        <w:pStyle w:val="Listing"/>
+      </w:pPr>
+      <w:r>
+        <w:t>&lt;</w:t>
+      </w:r>
+      <w:proofErr w:type="gramStart"/>
+      <w:r>
+        <w:t>h</w:t>
+      </w:r>
+      <w:proofErr w:type="gramEnd"/>
+      <w:r>
+        <w:t>2&gt;&lt;</w:t>
+      </w:r>
+      <w:proofErr w:type="spellStart"/>
+      <w:r>
+        <w:t>span</w:t>
+      </w:r>
+      <w:proofErr w:type="spellEnd"/>
+      <w:r>
+        <w:t xml:space="preserve"> class="</w:t>
+      </w:r>
+      <w:proofErr w:type="spellStart"/>
+      <w:r>
+        <w:t>htitle</w:t>
+      </w:r>
+      <w:proofErr w:type="spellEnd"/>
+      <w:r>
+        <w:t>"&gt;&amp;</w:t>
+      </w:r>
+      <w:proofErr w:type="spellStart"/>
+      <w:r>
+        <w:t>nbsp</w:t>
+      </w:r>
+      <w:proofErr w:type="spellEnd"/>
+      <w:r>
+        <w:t>;&lt;/</w:t>
+      </w:r>
+      <w:proofErr w:type="spellStart"/>
+      <w:r>
+        <w:t>span</w:t>
+      </w:r>
+      <w:proofErr w:type="spellEnd"/>
+      <w:r>
+        <w:t>&gt;&lt;</w:t>
+      </w:r>
+      <w:proofErr w:type="spellStart"/>
+      <w:r>
+        <w:t>span</w:t>
+      </w:r>
+      <w:proofErr w:type="spellEnd"/>
+      <w:r>
+        <w:t>&gt;Notes&lt;/</w:t>
+      </w:r>
+      <w:proofErr w:type="spellStart"/>
+      <w:r>
+        <w:t>span</w:t>
+      </w:r>
+      <w:proofErr w:type="spellEnd"/>
+      <w:r>
+        <w:t>&gt;&lt;/h2&gt;</w:t>
+      </w:r>
+    </w:p>
+    <w:p>
+      <w:pPr>
+        <w:pStyle w:val="Listing"/>
+      </w:pPr>
+      <w:r>
+        <w:t>&lt;</w:t>
+      </w:r>
+      <w:proofErr w:type="gramStart"/>
+      <w:r>
+        <w:t>h</w:t>
+      </w:r>
+      <w:proofErr w:type="gramEnd"/>
+      <w:r>
+        <w:t>3 class="</w:t>
+      </w:r>
+      <w:proofErr w:type="spellStart"/>
+      <w:r>
+        <w:t>note_type</w:t>
+      </w:r>
+      <w:proofErr w:type="spellEnd"/>
+      <w:r>
+        <w:t>"&gt;Naissance&lt;/h3&gt; &lt;p&gt;</w:t>
+      </w:r>
+    </w:p>
+    <w:p>
+      <w:pPr>
+        <w:pStyle w:val="Listing"/>
+      </w:pPr>
+      <w:r>
+        <w:t>Note1 sur la naissance&lt;</w:t>
+      </w:r>
+      <w:proofErr w:type="spellStart"/>
+      <w:r>
+        <w:t>br</w:t>
+      </w:r>
+      <w:proofErr w:type="spellEnd"/>
+      <w:r>
+        <w:t>&gt;</w:t>
+      </w:r>
+    </w:p>
+    <w:p>
+      <w:pPr>
+        <w:pStyle w:val="Listing"/>
+      </w:pPr>
+      <w:r>
+        <w:t>Note2 sur la naissance</w:t>
+      </w:r>
+    </w:p>
+    <w:p>
+      <w:pPr>
+        <w:pStyle w:val="Listing"/>
+      </w:pPr>
+      <w:r>
+        <w:t>&lt;/p&gt;&lt;h3 class="</w:t>
+      </w:r>
+      <w:proofErr w:type="spellStart"/>
+      <w:r>
+        <w:t>note_type</w:t>
+      </w:r>
+      <w:proofErr w:type="spellEnd"/>
+      <w:r>
+        <w:t>"&gt;Décès&lt;/h3&gt; &lt;p&gt;</w:t>
+      </w:r>
+    </w:p>
+    <w:p>
+      <w:pPr>
+        <w:pStyle w:val="Listing"/>
+      </w:pPr>
+      <w:r>
+        <w:t>Note1 sur le décès&lt;</w:t>
+      </w:r>
+      <w:proofErr w:type="spellStart"/>
+      <w:r>
+        <w:t>br</w:t>
+      </w:r>
+      <w:proofErr w:type="spellEnd"/>
+      <w:r>
+        <w:t>&gt;</w:t>
+      </w:r>
+    </w:p>
+    <w:p>
+      <w:pPr>
+        <w:pStyle w:val="Listing"/>
+      </w:pPr>
+      <w:r>
+        <w:t>Note2 sur le décès</w:t>
+      </w:r>
+    </w:p>
+    <w:p>
+      <w:pPr>
+        <w:pStyle w:val="Listing"/>
+      </w:pPr>
+      <w:r>
+        <w:t>&lt;/p&gt;&lt;p style="</w:t>
+      </w:r>
+      <w:proofErr w:type="spellStart"/>
+      <w:proofErr w:type="gramStart"/>
+      <w:r>
+        <w:t>clear:both</w:t>
+      </w:r>
+      <w:proofErr w:type="spellEnd"/>
+      <w:proofErr w:type="gramEnd"/>
+      <w:r>
+        <w:t>; margin:0;"&gt;&lt;/p&gt;</w:t>
+      </w:r>
+    </w:p>
+    <w:p>
+      <w:pPr>
+        <w:pStyle w:val="Listing"/>
+      </w:pPr>
+      <w:r>
+        <w:t xml:space="preserve"> &lt;</w:t>
+      </w:r>
+      <w:proofErr w:type="gramStart"/>
+      <w:r>
+        <w:t>h</w:t>
+      </w:r>
+      <w:proofErr w:type="gramEnd"/>
+      <w:r>
+        <w:t>2&gt;&lt;</w:t>
+      </w:r>
+      <w:proofErr w:type="spellStart"/>
+      <w:r>
+        <w:t>span</w:t>
+      </w:r>
+      <w:proofErr w:type="spellEnd"/>
+      <w:r>
+        <w:t xml:space="preserve"> class="</w:t>
+      </w:r>
+      <w:proofErr w:type="spellStart"/>
+      <w:r>
+        <w:t>htitle</w:t>
+      </w:r>
+      <w:proofErr w:type="spellEnd"/>
+      <w:r>
+        <w:t>"&gt;&amp;</w:t>
+      </w:r>
+      <w:proofErr w:type="spellStart"/>
+      <w:r>
+        <w:t>nbsp</w:t>
+      </w:r>
+      <w:proofErr w:type="spellEnd"/>
+      <w:r>
+        <w:t>;&lt;/</w:t>
+      </w:r>
+      <w:proofErr w:type="spellStart"/>
+      <w:r>
+        <w:t>span</w:t>
+      </w:r>
+      <w:proofErr w:type="spellEnd"/>
+      <w:r>
+        <w:t>&gt;&lt;</w:t>
+      </w:r>
+      <w:proofErr w:type="spellStart"/>
+      <w:r>
+        <w:t>span</w:t>
+      </w:r>
+      <w:proofErr w:type="spellEnd"/>
+      <w:r>
+        <w:t>&gt;Notes concernant l'union&lt;/</w:t>
+      </w:r>
+      <w:proofErr w:type="spellStart"/>
+      <w:r>
+        <w:t>span</w:t>
+      </w:r>
+      <w:proofErr w:type="spellEnd"/>
+      <w:r>
+        <w:t>&gt;&lt;/h2&gt;</w:t>
+      </w:r>
+    </w:p>
+    <w:p>
+      <w:pPr>
+        <w:pStyle w:val="Listing"/>
+      </w:pPr>
+      <w:r>
+        <w:t>&lt;</w:t>
+      </w:r>
+      <w:proofErr w:type="gramStart"/>
+      <w:r>
+        <w:t>h</w:t>
+      </w:r>
+      <w:proofErr w:type="gramEnd"/>
+      <w:r>
+        <w:t>3 class="</w:t>
+      </w:r>
+      <w:proofErr w:type="spellStart"/>
+      <w:r>
+        <w:t>note_type</w:t>
+      </w:r>
+      <w:proofErr w:type="spellEnd"/>
+      <w:r>
+        <w:t>"&gt;Union avec Marie Paule DURAND&lt;/h3&gt; &lt;p&gt;</w:t>
+      </w:r>
+    </w:p>
+    <w:p>
+      <w:pPr>
+        <w:pStyle w:val="Listing"/>
+      </w:pPr>
+      <w:r>
+        <w:t>Note1 sur le mariage&lt;</w:t>
+      </w:r>
+      <w:proofErr w:type="spellStart"/>
+      <w:r>
+        <w:t>br</w:t>
+      </w:r>
+      <w:proofErr w:type="spellEnd"/>
+      <w:r>
+        <w:t>&gt;</w:t>
+      </w:r>
+    </w:p>
+    <w:p>
+      <w:pPr>
+        <w:pStyle w:val="Listing"/>
+      </w:pPr>
+      <w:r>
+        <w:t>Note2 sur le mariage</w:t>
+      </w:r>
+    </w:p>
+    <w:p>
+      <w:pPr>
+        <w:pStyle w:val="Listing"/>
+      </w:pPr>
+      <w:r>
+        <w:t>&lt;/p&gt;&lt;p style="</w:t>
+      </w:r>
+      <w:proofErr w:type="spellStart"/>
+      <w:proofErr w:type="gramStart"/>
+      <w:r>
+        <w:t>clear:both</w:t>
+      </w:r>
+      <w:proofErr w:type="spellEnd"/>
+      <w:proofErr w:type="gramEnd"/>
+      <w:r>
+        <w:t>; margin:0;"&gt;&lt;/p&gt;</w:t>
+      </w:r>
+    </w:p>
+    <w:p/>
+    <w:p/>
+    <w:p>
+      <w:proofErr w:type="spellStart"/>
+      <w:proofErr w:type="gramStart"/>
+      <w:r>
+        <w:rPr>
+          <w:rStyle w:val="kn"/>
+          <w:rFonts w:eastAsiaTheme="majorEastAsia"/>
+          <w:highlight w:val="cyan"/>
+        </w:rPr>
+        <w:t>scrapy</w:t>
+      </w:r>
+      <w:proofErr w:type="spellEnd"/>
+      <w:proofErr w:type="gramEnd"/>
+      <w:r>
+        <w:rPr>
+          <w:rStyle w:val="kn"/>
+          <w:rFonts w:eastAsiaTheme="majorEastAsia"/>
+          <w:highlight w:val="cyan"/>
+        </w:rPr>
+        <w:t xml:space="preserve"> </w:t>
+      </w:r>
+      <w:proofErr w:type="spellStart"/>
+      <w:r>
+        <w:rPr>
+          <w:rStyle w:val="kn"/>
+          <w:rFonts w:eastAsiaTheme="majorEastAsia"/>
+          <w:highlight w:val="cyan"/>
+        </w:rPr>
+        <w:t>shel</w:t>
+      </w:r>
+      <w:r>
+        <w:rPr>
+          <w:rStyle w:val="kn"/>
+          <w:rFonts w:eastAsiaTheme="majorEastAsia"/>
+          <w:highlight w:val="cyan"/>
+        </w:rPr>
+        <w:t>l</w:t>
+      </w:r>
+      <w:proofErr w:type="spellEnd"/>
+      <w:r>
+        <w:rPr>
+          <w:rStyle w:val="kn"/>
+          <w:rFonts w:eastAsiaTheme="majorEastAsia"/>
+          <w:highlight w:val="cyan"/>
+        </w:rPr>
+        <w:t xml:space="preserve"> </w:t>
+      </w:r>
+      <w:r>
+        <w:rPr>
+          <w:rStyle w:val="n"/>
+          <w:rFonts w:eastAsiaTheme="majorEastAsia"/>
+          <w:highlight w:val="cyan"/>
+        </w:rPr>
+        <w:t>"</w:t>
+      </w:r>
+      <w:r>
+        <w:t>https://gw.geneanet.org/nraibaut2?lang=</w:t>
+      </w:r>
+      <w:proofErr w:type="spellStart"/>
+      <w:r>
+        <w:t>fr&amp;p</w:t>
+      </w:r>
+      <w:proofErr w:type="spellEnd"/>
+      <w:r>
+        <w:t>=</w:t>
+      </w:r>
+      <w:proofErr w:type="spellStart"/>
+      <w:r>
+        <w:t>pierre&amp;n</w:t>
+      </w:r>
+      <w:proofErr w:type="spellEnd"/>
+      <w:r>
+        <w:t>=</w:t>
+      </w:r>
+      <w:proofErr w:type="spellStart"/>
+      <w:r>
+        <w:t>dupont</w:t>
+      </w:r>
+      <w:proofErr w:type="spellEnd"/>
+      <w:r>
+        <w:t>"</w:t>
+      </w:r>
+    </w:p>
+    <w:p/>
+    <w:p>
+      <w:proofErr w:type="gramStart"/>
+      <w:r>
+        <w:t>response.xpath</w:t>
+      </w:r>
+      <w:proofErr w:type="gramEnd"/>
+      <w:r>
+        <w:t>("//h2[span='Notes']/following-sibling::h3[@class='note_type']").extract()</w:t>
+      </w:r>
+    </w:p>
+    <w:p>
+      <w:r>
+        <w:t>['&lt;h3 class="</w:t>
+      </w:r>
+      <w:proofErr w:type="spellStart"/>
+      <w:r>
+        <w:t>note_type</w:t>
+      </w:r>
+      <w:proofErr w:type="spellEnd"/>
+      <w:r>
+        <w:t>"&gt;Naissance&lt;/h3&gt;', '&lt;h3 class="</w:t>
+      </w:r>
+      <w:proofErr w:type="spellStart"/>
+      <w:r>
+        <w:t>note_type</w:t>
+      </w:r>
+      <w:proofErr w:type="spellEnd"/>
+      <w:r>
+        <w:t>"&gt;Décès&lt;/h3&gt;', '&lt;h3 class="</w:t>
+      </w:r>
+      <w:proofErr w:type="spellStart"/>
+      <w:r>
+        <w:t>note_type</w:t>
+      </w:r>
+      <w:proofErr w:type="spellEnd"/>
+      <w:r>
+        <w:t>"&gt;Union avec Marie Paule DURAND&lt;/h3&gt;']</w:t>
+      </w:r>
+    </w:p>
+    <w:p/>
+    <w:p/>
+    <w:p>
+      <w:bookmarkStart w:id="1" w:name="_Hlk143032613"/>
+      <w:r>
+        <w:t xml:space="preserve">Cas </w:t>
+      </w:r>
+      <w:hyperlink r:id="rId10" w:history="1">
+        <w:r>
+          <w:rPr>
+            <w:rStyle w:val="Lienhypertexte"/>
+          </w:rPr>
+          <w:t>https://gw.geneanet.org/nraibaut2?lang=fr&amp;p=jean&amp;n=dates</w:t>
+        </w:r>
+      </w:hyperlink>
+      <w:r>
+        <w:t> :</w:t>
+      </w:r>
+    </w:p>
+    <w:p>
+      <w:r>
+        <w:drawing>
+          <wp:inline distT="0" distB="0" distL="0" distR="0" wp14:anchorId="78200BF3" wp14:editId="00777240">
+            <wp:extent cx="1819529" cy="704948"/>
+            <wp:effectExtent l="0" t="0" r="9525" b="0"/>
+            <wp:docPr id="1288197431" name="Image 1"/>
+            <wp:cNvGraphicFramePr>
+              <a:graphicFrameLocks xmlns:a="http://schemas.openxmlformats.org/drawingml/2006/main" noChangeAspect="1"/>
+            </wp:cNvGraphicFramePr>
+            <a:graphic xmlns:a="http://schemas.openxmlformats.org/drawingml/2006/main">
+              <a:graphicData uri="http://schemas.openxmlformats.org/drawingml/2006/picture">
+                <pic:pic xmlns:pic="http://schemas.openxmlformats.org/drawingml/2006/picture">
+                  <pic:nvPicPr>
+                    <pic:cNvPr id="1288197431" name=""/>
+                    <pic:cNvPicPr/>
+                  </pic:nvPicPr>
+                  <pic:blipFill>
+                    <a:blip r:embed="rId11"/>
+                    <a:stretch>
+                      <a:fillRect/>
+                    </a:stretch>
+                  </pic:blipFill>
+                  <pic:spPr>
+                    <a:xfrm>
+                      <a:off x="0" y="0"/>
+                      <a:ext cx="1819529" cy="704948"/>
+                    </a:xfrm>
+                    <a:prstGeom prst="rect">
+                      <a:avLst/>
+                    </a:prstGeom>
+                  </pic:spPr>
+                </pic:pic>
+              </a:graphicData>
+            </a:graphic>
+          </wp:inline>
+        </w:drawing>
+      </w:r>
+    </w:p>
+    <w:p>
+      <w:pPr>
+        <w:pStyle w:val="Listing"/>
+      </w:pPr>
+      <w:proofErr w:type="gramStart"/>
+      <w:r>
+        <w:rPr>
+          <w:rStyle w:val="comment"/>
+          <w:rFonts w:eastAsiaTheme="majorEastAsia"/>
+        </w:rPr>
+        <w:t>&lt;!--</w:t>
+      </w:r>
+      <w:proofErr w:type="gramEnd"/>
+      <w:r>
+        <w:rPr>
+          <w:rStyle w:val="comment"/>
+          <w:rFonts w:eastAsiaTheme="majorEastAsia"/>
+        </w:rPr>
+        <w:t xml:space="preserve"> notes --&gt;</w:t>
+      </w:r>
+    </w:p>
+    <w:p>
+      <w:pPr>
+        <w:pStyle w:val="Listing"/>
+      </w:pPr>
+      <w:r>
+        <w:t>&lt;</w:t>
+      </w:r>
+      <w:proofErr w:type="gramStart"/>
+      <w:r>
+        <w:rPr>
+          <w:rStyle w:val="start-tag"/>
+        </w:rPr>
+        <w:t>a</w:t>
+      </w:r>
+      <w:proofErr w:type="gramEnd"/>
+      <w:r>
+        <w:t xml:space="preserve"> </w:t>
+      </w:r>
+      <w:proofErr w:type="spellStart"/>
+      <w:r>
+        <w:rPr>
+          <w:rStyle w:val="attribute-name"/>
+        </w:rPr>
+        <w:t>name</w:t>
+      </w:r>
+      <w:proofErr w:type="spellEnd"/>
+      <w:r>
+        <w:t>="notes"&gt;&lt;/</w:t>
+      </w:r>
+      <w:r>
+        <w:rPr>
+          <w:rStyle w:val="end-tag"/>
+          <w:rFonts w:eastAsiaTheme="majorEastAsia"/>
+        </w:rPr>
+        <w:t>a</w:t>
+      </w:r>
+      <w:r>
+        <w:t>&gt;</w:t>
+      </w:r>
+    </w:p>
+    <w:p>
+      <w:pPr>
+        <w:pStyle w:val="Listing"/>
+      </w:pPr>
+      <w:r>
+        <w:lastRenderedPageBreak/>
+        <w:t>&lt;</w:t>
+      </w:r>
+      <w:proofErr w:type="gramStart"/>
+      <w:r>
+        <w:rPr>
+          <w:rStyle w:val="start-tag"/>
+        </w:rPr>
+        <w:t>h</w:t>
+      </w:r>
+      <w:proofErr w:type="gramEnd"/>
+      <w:r>
+        <w:rPr>
+          <w:rStyle w:val="start-tag"/>
+        </w:rPr>
+        <w:t>2</w:t>
+      </w:r>
+      <w:r>
+        <w:t>&gt;&lt;</w:t>
+      </w:r>
+      <w:proofErr w:type="spellStart"/>
+      <w:r>
+        <w:rPr>
+          <w:rStyle w:val="start-tag"/>
+        </w:rPr>
+        <w:t>span</w:t>
+      </w:r>
+      <w:proofErr w:type="spellEnd"/>
+      <w:r>
+        <w:t xml:space="preserve"> </w:t>
+      </w:r>
+      <w:r>
+        <w:rPr>
+          <w:rStyle w:val="attribute-name"/>
+        </w:rPr>
+        <w:t>class</w:t>
+      </w:r>
+      <w:r>
+        <w:t>="</w:t>
+      </w:r>
+      <w:proofErr w:type="spellStart"/>
+      <w:r>
+        <w:t>htitle</w:t>
+      </w:r>
+      <w:proofErr w:type="spellEnd"/>
+      <w:r>
+        <w:t>"&gt;</w:t>
+      </w:r>
+      <w:r>
+        <w:rPr>
+          <w:rStyle w:val="entity"/>
+          <w:rFonts w:eastAsiaTheme="majorEastAsia"/>
+        </w:rPr>
+        <w:t>&amp;</w:t>
+      </w:r>
+      <w:proofErr w:type="spellStart"/>
+      <w:r>
+        <w:rPr>
+          <w:rStyle w:val="entity"/>
+          <w:rFonts w:eastAsiaTheme="majorEastAsia"/>
+        </w:rPr>
+        <w:t>nbsp</w:t>
+      </w:r>
+      <w:proofErr w:type="spellEnd"/>
+      <w:r>
+        <w:rPr>
+          <w:rStyle w:val="entity"/>
+          <w:rFonts w:eastAsiaTheme="majorEastAsia"/>
+        </w:rPr>
+        <w:t>;</w:t>
+      </w:r>
+      <w:r>
+        <w:t>&lt;/</w:t>
+      </w:r>
+      <w:proofErr w:type="spellStart"/>
+      <w:r>
+        <w:rPr>
+          <w:rStyle w:val="end-tag"/>
+          <w:rFonts w:eastAsiaTheme="majorEastAsia"/>
+        </w:rPr>
+        <w:t>span</w:t>
+      </w:r>
+      <w:proofErr w:type="spellEnd"/>
+      <w:r>
+        <w:t>&gt;&lt;</w:t>
+      </w:r>
+      <w:proofErr w:type="spellStart"/>
+      <w:r>
+        <w:rPr>
+          <w:rStyle w:val="start-tag"/>
+        </w:rPr>
+        <w:t>span</w:t>
+      </w:r>
+      <w:proofErr w:type="spellEnd"/>
+      <w:r>
+        <w:t>&gt;Notes&lt;/</w:t>
+      </w:r>
+      <w:proofErr w:type="spellStart"/>
+      <w:r>
+        <w:rPr>
+          <w:rStyle w:val="end-tag"/>
+          <w:rFonts w:eastAsiaTheme="majorEastAsia"/>
+        </w:rPr>
+        <w:t>span</w:t>
+      </w:r>
+      <w:proofErr w:type="spellEnd"/>
+      <w:r>
+        <w:t>&gt;&lt;/</w:t>
+      </w:r>
+      <w:r>
+        <w:rPr>
+          <w:rStyle w:val="end-tag"/>
+          <w:rFonts w:eastAsiaTheme="majorEastAsia"/>
+        </w:rPr>
+        <w:t>h2</w:t>
+      </w:r>
+      <w:r>
+        <w:t>&gt;</w:t>
+      </w:r>
+    </w:p>
+    <w:p>
+      <w:pPr>
+        <w:pStyle w:val="Listing"/>
+      </w:pPr>
+      <w:r>
+        <w:t>&lt;</w:t>
+      </w:r>
+      <w:proofErr w:type="gramStart"/>
+      <w:r>
+        <w:rPr>
+          <w:rStyle w:val="start-tag"/>
+        </w:rPr>
+        <w:t>h</w:t>
+      </w:r>
+      <w:proofErr w:type="gramEnd"/>
+      <w:r>
+        <w:rPr>
+          <w:rStyle w:val="start-tag"/>
+        </w:rPr>
+        <w:t>3</w:t>
+      </w:r>
+      <w:r>
+        <w:t xml:space="preserve"> </w:t>
+      </w:r>
+      <w:r>
+        <w:rPr>
+          <w:rStyle w:val="attribute-name"/>
+        </w:rPr>
+        <w:t>class</w:t>
+      </w:r>
+      <w:r>
+        <w:t>="</w:t>
+      </w:r>
+      <w:proofErr w:type="spellStart"/>
+      <w:r>
+        <w:t>note_type</w:t>
+      </w:r>
+      <w:proofErr w:type="spellEnd"/>
+      <w:r>
+        <w:t>"&gt;Notes individuelles&lt;/</w:t>
+      </w:r>
+      <w:r>
+        <w:rPr>
+          <w:rStyle w:val="end-tag"/>
+          <w:rFonts w:eastAsiaTheme="majorEastAsia"/>
+        </w:rPr>
+        <w:t>h3</w:t>
+      </w:r>
+      <w:r>
+        <w:t>&gt;</w:t>
+      </w:r>
+    </w:p>
+    <w:p>
+      <w:pPr>
+        <w:pStyle w:val="Listing"/>
+      </w:pPr>
+      <w:r>
+        <w:t>&lt;</w:t>
+      </w:r>
+      <w:proofErr w:type="gramStart"/>
+      <w:r>
+        <w:rPr>
+          <w:rStyle w:val="start-tag"/>
+        </w:rPr>
+        <w:t>div</w:t>
+      </w:r>
+      <w:proofErr w:type="gramEnd"/>
+      <w:r>
+        <w:t xml:space="preserve"> </w:t>
+      </w:r>
+      <w:r>
+        <w:rPr>
+          <w:rStyle w:val="attribute-name"/>
+        </w:rPr>
+        <w:t>class</w:t>
+      </w:r>
+      <w:r>
+        <w:t>="fiche-note-</w:t>
+      </w:r>
+      <w:proofErr w:type="spellStart"/>
+      <w:r>
+        <w:t>ind</w:t>
+      </w:r>
+      <w:proofErr w:type="spellEnd"/>
+      <w:r>
+        <w:t>"&gt;</w:t>
+      </w:r>
+    </w:p>
+    <w:p>
+      <w:pPr>
+        <w:pStyle w:val="Listing"/>
+      </w:pPr>
+      <w:proofErr w:type="gramStart"/>
+      <w:r>
+        <w:t>Retraite:</w:t>
+      </w:r>
+      <w:proofErr w:type="gramEnd"/>
+      <w:r>
+        <w:t xml:space="preserve"> &lt;/</w:t>
+      </w:r>
+      <w:r>
+        <w:rPr>
+          <w:rStyle w:val="end-tag"/>
+          <w:rFonts w:eastAsiaTheme="majorEastAsia"/>
+        </w:rPr>
+        <w:t>div</w:t>
+      </w:r>
+      <w:r>
+        <w:t>&gt;</w:t>
+      </w:r>
+    </w:p>
+    <w:p>
+      <w:pPr>
+        <w:pStyle w:val="Listing"/>
+      </w:pPr>
+      <w:r>
+        <w:t>&lt;</w:t>
+      </w:r>
+      <w:proofErr w:type="gramStart"/>
+      <w:r>
+        <w:rPr>
+          <w:rStyle w:val="start-tag"/>
+        </w:rPr>
+        <w:t>p</w:t>
+      </w:r>
+      <w:proofErr w:type="gramEnd"/>
+      <w:r>
+        <w:t xml:space="preserve"> </w:t>
+      </w:r>
+      <w:r>
+        <w:rPr>
+          <w:rStyle w:val="attribute-name"/>
+        </w:rPr>
+        <w:t>style</w:t>
+      </w:r>
+      <w:r>
+        <w:t>="</w:t>
+      </w:r>
+      <w:proofErr w:type="spellStart"/>
+      <w:r>
+        <w:t>clear:both</w:t>
+      </w:r>
+      <w:proofErr w:type="spellEnd"/>
+      <w:r>
+        <w:t>; margin:0;"&gt;&lt;/</w:t>
+      </w:r>
+      <w:r>
+        <w:rPr>
+          <w:rStyle w:val="end-tag"/>
+          <w:rFonts w:eastAsiaTheme="majorEastAsia"/>
+        </w:rPr>
+        <w:t>p</w:t>
+      </w:r>
+      <w:r>
+        <w:t>&gt;</w:t>
+      </w:r>
+    </w:p>
+    <w:p>
+      <w:pPr>
+        <w:pStyle w:val="Listing"/>
+      </w:pPr>
+      <w:r>
+        <w:t xml:space="preserve"> &lt;</w:t>
+      </w:r>
+      <w:proofErr w:type="gramStart"/>
+      <w:r>
+        <w:rPr>
+          <w:rStyle w:val="start-tag"/>
+        </w:rPr>
+        <w:t>p</w:t>
+      </w:r>
+      <w:proofErr w:type="gramEnd"/>
+      <w:r>
+        <w:t xml:space="preserve"> </w:t>
+      </w:r>
+      <w:r>
+        <w:rPr>
+          <w:rStyle w:val="attribute-name"/>
+        </w:rPr>
+        <w:t>style</w:t>
+      </w:r>
+      <w:r>
+        <w:t>="</w:t>
+      </w:r>
+      <w:proofErr w:type="spellStart"/>
+      <w:r>
+        <w:t>clear:both</w:t>
+      </w:r>
+      <w:proofErr w:type="spellEnd"/>
+      <w:r>
+        <w:t>; margin:0;"&gt;&lt;/</w:t>
+      </w:r>
+      <w:r>
+        <w:rPr>
+          <w:rStyle w:val="end-tag"/>
+          <w:rFonts w:eastAsiaTheme="majorEastAsia"/>
+        </w:rPr>
+        <w:t>p</w:t>
+      </w:r>
+      <w:r>
+        <w:t>&gt;</w:t>
+      </w:r>
+    </w:p>
+    <w:p/>
+    <w:p/>
+    <w:p/>
+    <w:p>
+      <w:pPr>
+        <w:autoSpaceDE w:val="0"/>
+        <w:autoSpaceDN w:val="0"/>
+        <w:adjustRightInd w:val="0"/>
+        <w:rPr>
+          <w:rFonts w:ascii="Lucida Console" w:hAnsi="Lucida Console" w:cs="Lucida Console"/>
+          <w:kern w:val="0"/>
+          <w:sz w:val="18"/>
+          <w:szCs w:val="18"/>
+        </w:rPr>
+      </w:pPr>
+      <w:proofErr w:type="spellStart"/>
+      <w:proofErr w:type="gramStart"/>
+      <w:r>
+        <w:rPr>
+          <w:rFonts w:ascii="Lucida Console" w:hAnsi="Lucida Console" w:cs="Lucida Console"/>
+          <w:kern w:val="0"/>
+          <w:sz w:val="18"/>
+          <w:szCs w:val="18"/>
+        </w:rPr>
+        <w:t>egrep</w:t>
+      </w:r>
+      <w:proofErr w:type="spellEnd"/>
+      <w:proofErr w:type="gramEnd"/>
+      <w:r>
+        <w:rPr>
+          <w:rFonts w:ascii="Lucida Console" w:hAnsi="Lucida Console" w:cs="Lucida Console"/>
+          <w:kern w:val="0"/>
+          <w:sz w:val="18"/>
+          <w:szCs w:val="18"/>
+        </w:rPr>
+        <w:t xml:space="preserve"> 'Notes individuelles' </w:t>
+      </w:r>
+      <w:proofErr w:type="spellStart"/>
+      <w:r>
+        <w:rPr>
+          <w:rFonts w:ascii="Lucida Console" w:hAnsi="Lucida Console" w:cs="Lucida Console"/>
+          <w:kern w:val="0"/>
+          <w:sz w:val="18"/>
+          <w:szCs w:val="18"/>
+        </w:rPr>
+        <w:t>result</w:t>
+      </w:r>
+      <w:proofErr w:type="spellEnd"/>
+      <w:r>
+        <w:rPr>
+          <w:rFonts w:ascii="Lucida Console" w:hAnsi="Lucida Console" w:cs="Lucida Console"/>
+          <w:kern w:val="0"/>
+          <w:sz w:val="18"/>
+          <w:szCs w:val="18"/>
+        </w:rPr>
+        <w:t>/*.log</w:t>
+      </w:r>
+    </w:p>
+    <w:p>
+      <w:pPr>
+        <w:autoSpaceDE w:val="0"/>
+        <w:autoSpaceDN w:val="0"/>
+        <w:adjustRightInd w:val="0"/>
+        <w:rPr>
+          <w:rFonts w:ascii="Lucida Console" w:hAnsi="Lucida Console" w:cs="Lucida Console"/>
+          <w:kern w:val="0"/>
+          <w:sz w:val="18"/>
+          <w:szCs w:val="18"/>
+        </w:rPr>
+      </w:pPr>
+      <w:r>
+        <w:rPr>
+          <w:rFonts w:ascii="Lucida Console" w:hAnsi="Lucida Console" w:cs="Lucida Console"/>
+          <w:kern w:val="0"/>
+          <w:sz w:val="18"/>
+          <w:szCs w:val="18"/>
+        </w:rPr>
+        <w:t>result/gw.geneanet.org.danielr13.lang=fr.n=</w:t>
+      </w:r>
+      <w:proofErr w:type="gramStart"/>
+      <w:r>
+        <w:rPr>
+          <w:rFonts w:ascii="Lucida Console" w:hAnsi="Lucida Console" w:cs="Lucida Console"/>
+          <w:kern w:val="0"/>
+          <w:sz w:val="18"/>
+          <w:szCs w:val="18"/>
+        </w:rPr>
+        <w:t>nicolas.oc=0.p</w:t>
+      </w:r>
+      <w:proofErr w:type="gramEnd"/>
+      <w:r>
+        <w:rPr>
+          <w:rFonts w:ascii="Lucida Console" w:hAnsi="Lucida Console" w:cs="Lucida Console"/>
+          <w:kern w:val="0"/>
+          <w:sz w:val="18"/>
+          <w:szCs w:val="18"/>
+        </w:rPr>
+        <w:t xml:space="preserve">=etienne+henri.log:[geneanet] DEBUG: </w:t>
+      </w:r>
+      <w:proofErr w:type="spellStart"/>
+      <w:r>
+        <w:rPr>
+          <w:rFonts w:ascii="Lucida Console" w:hAnsi="Lucida Console" w:cs="Lucida Console"/>
+          <w:kern w:val="0"/>
+          <w:sz w:val="18"/>
+          <w:szCs w:val="18"/>
+        </w:rPr>
+        <w:t>Generation</w:t>
+      </w:r>
+      <w:proofErr w:type="spellEnd"/>
+      <w:r>
+        <w:rPr>
+          <w:rFonts w:ascii="Lucida Console" w:hAnsi="Lucida Console" w:cs="Lucida Console"/>
+          <w:kern w:val="0"/>
+          <w:sz w:val="18"/>
+          <w:szCs w:val="18"/>
+        </w:rPr>
+        <w:t xml:space="preserve"> 8, </w:t>
+      </w:r>
+      <w:proofErr w:type="spellStart"/>
+      <w:r>
+        <w:rPr>
+          <w:rFonts w:ascii="Lucida Console" w:hAnsi="Lucida Console" w:cs="Lucida Console"/>
+          <w:kern w:val="0"/>
+          <w:sz w:val="18"/>
+          <w:szCs w:val="18"/>
+        </w:rPr>
+        <w:t>sosa</w:t>
+      </w:r>
+      <w:proofErr w:type="spellEnd"/>
+      <w:r>
+        <w:rPr>
+          <w:rFonts w:ascii="Lucida Console" w:hAnsi="Lucida Console" w:cs="Lucida Console"/>
+          <w:kern w:val="0"/>
+          <w:sz w:val="18"/>
+          <w:szCs w:val="18"/>
+        </w:rPr>
+        <w:t xml:space="preserve"> 146 : Jean Baptiste BOSC : note 1 : </w:t>
+      </w:r>
+      <w:proofErr w:type="spellStart"/>
+      <w:r>
+        <w:rPr>
+          <w:rFonts w:ascii="Lucida Console" w:hAnsi="Lucida Console" w:cs="Lucida Console"/>
+          <w:kern w:val="0"/>
+          <w:sz w:val="18"/>
+          <w:szCs w:val="18"/>
+        </w:rPr>
+        <w:t>note_type</w:t>
+      </w:r>
+      <w:proofErr w:type="spellEnd"/>
+      <w:r>
+        <w:rPr>
+          <w:rFonts w:ascii="Lucida Console" w:hAnsi="Lucida Console" w:cs="Lucida Console"/>
+          <w:kern w:val="0"/>
+          <w:sz w:val="18"/>
+          <w:szCs w:val="18"/>
+        </w:rPr>
+        <w:t xml:space="preserve">='Notes individuelles' </w:t>
+      </w:r>
+      <w:proofErr w:type="spellStart"/>
+      <w:r>
+        <w:rPr>
+          <w:rFonts w:ascii="Lucida Console" w:hAnsi="Lucida Console" w:cs="Lucida Console"/>
+          <w:kern w:val="0"/>
+          <w:sz w:val="18"/>
+          <w:szCs w:val="18"/>
+        </w:rPr>
+        <w:t>note_text</w:t>
+      </w:r>
+      <w:proofErr w:type="spellEnd"/>
+      <w:r>
+        <w:rPr>
+          <w:rFonts w:ascii="Lucida Console" w:hAnsi="Lucida Console" w:cs="Lucida Console"/>
+          <w:kern w:val="0"/>
+          <w:sz w:val="18"/>
+          <w:szCs w:val="18"/>
+        </w:rPr>
+        <w:t>=''</w:t>
+      </w:r>
+    </w:p>
+    <w:p>
+      <w:pPr>
+        <w:autoSpaceDE w:val="0"/>
+        <w:autoSpaceDN w:val="0"/>
+        <w:adjustRightInd w:val="0"/>
+        <w:rPr>
+          <w:rFonts w:ascii="Lucida Console" w:hAnsi="Lucida Console" w:cs="Lucida Console"/>
+          <w:kern w:val="0"/>
+          <w:sz w:val="18"/>
+          <w:szCs w:val="18"/>
+        </w:rPr>
+      </w:pPr>
+      <w:r>
+        <w:rPr>
+          <w:rFonts w:ascii="Lucida Console" w:hAnsi="Lucida Console" w:cs="Lucida Console"/>
+          <w:kern w:val="0"/>
+          <w:sz w:val="18"/>
+          <w:szCs w:val="18"/>
+        </w:rPr>
+        <w:t>result/gw.geneanet.org.danielr13.lang=fr.n=</w:t>
+      </w:r>
+      <w:proofErr w:type="gramStart"/>
+      <w:r>
+        <w:rPr>
+          <w:rFonts w:ascii="Lucida Console" w:hAnsi="Lucida Console" w:cs="Lucida Console"/>
+          <w:kern w:val="0"/>
+          <w:sz w:val="18"/>
+          <w:szCs w:val="18"/>
+        </w:rPr>
+        <w:t>nicolas.oc=0.p</w:t>
+      </w:r>
+      <w:proofErr w:type="gramEnd"/>
+      <w:r>
+        <w:rPr>
+          <w:rFonts w:ascii="Lucida Console" w:hAnsi="Lucida Console" w:cs="Lucida Console"/>
+          <w:kern w:val="0"/>
+          <w:sz w:val="18"/>
+          <w:szCs w:val="18"/>
+        </w:rPr>
+        <w:t xml:space="preserve">=etienne+henri.log:[geneanet] DEBUG: </w:t>
+      </w:r>
+      <w:proofErr w:type="spellStart"/>
+      <w:r>
+        <w:rPr>
+          <w:rFonts w:ascii="Lucida Console" w:hAnsi="Lucida Console" w:cs="Lucida Console"/>
+          <w:kern w:val="0"/>
+          <w:sz w:val="18"/>
+          <w:szCs w:val="18"/>
+        </w:rPr>
+        <w:t>Generation</w:t>
+      </w:r>
+      <w:proofErr w:type="spellEnd"/>
+      <w:r>
+        <w:rPr>
+          <w:rFonts w:ascii="Lucida Console" w:hAnsi="Lucida Console" w:cs="Lucida Console"/>
+          <w:kern w:val="0"/>
+          <w:sz w:val="18"/>
+          <w:szCs w:val="18"/>
+        </w:rPr>
+        <w:t xml:space="preserve"> 9, </w:t>
+      </w:r>
+      <w:proofErr w:type="spellStart"/>
+      <w:r>
+        <w:rPr>
+          <w:rFonts w:ascii="Lucida Console" w:hAnsi="Lucida Console" w:cs="Lucida Console"/>
+          <w:kern w:val="0"/>
+          <w:sz w:val="18"/>
+          <w:szCs w:val="18"/>
+        </w:rPr>
+        <w:t>sosa</w:t>
+      </w:r>
+      <w:proofErr w:type="spellEnd"/>
+      <w:r>
+        <w:rPr>
+          <w:rFonts w:ascii="Lucida Console" w:hAnsi="Lucida Console" w:cs="Lucida Console"/>
+          <w:kern w:val="0"/>
+          <w:sz w:val="18"/>
+          <w:szCs w:val="18"/>
+        </w:rPr>
+        <w:t xml:space="preserve"> 437 : Anne BARD : note 1 : </w:t>
+      </w:r>
+      <w:proofErr w:type="spellStart"/>
+      <w:r>
+        <w:rPr>
+          <w:rFonts w:ascii="Lucida Console" w:hAnsi="Lucida Console" w:cs="Lucida Console"/>
+          <w:kern w:val="0"/>
+          <w:sz w:val="18"/>
+          <w:szCs w:val="18"/>
+        </w:rPr>
+        <w:t>note_type</w:t>
+      </w:r>
+      <w:proofErr w:type="spellEnd"/>
+      <w:r>
+        <w:rPr>
+          <w:rFonts w:ascii="Lucida Console" w:hAnsi="Lucida Console" w:cs="Lucida Console"/>
+          <w:kern w:val="0"/>
+          <w:sz w:val="18"/>
+          <w:szCs w:val="18"/>
+        </w:rPr>
+        <w:t xml:space="preserve">='Notes individuelles' </w:t>
+      </w:r>
+      <w:proofErr w:type="spellStart"/>
+      <w:r>
+        <w:rPr>
+          <w:rFonts w:ascii="Lucida Console" w:hAnsi="Lucida Console" w:cs="Lucida Console"/>
+          <w:kern w:val="0"/>
+          <w:sz w:val="18"/>
+          <w:szCs w:val="18"/>
+        </w:rPr>
+        <w:t>note_text</w:t>
+      </w:r>
+      <w:proofErr w:type="spellEnd"/>
+      <w:r>
+        <w:rPr>
+          <w:rFonts w:ascii="Lucida Console" w:hAnsi="Lucida Console" w:cs="Lucida Console"/>
+          <w:kern w:val="0"/>
+          <w:sz w:val="18"/>
+          <w:szCs w:val="18"/>
+        </w:rPr>
+        <w:t>=''</w:t>
+      </w:r>
+    </w:p>
+    <w:p>
+      <w:pPr>
+        <w:autoSpaceDE w:val="0"/>
+        <w:autoSpaceDN w:val="0"/>
+        <w:adjustRightInd w:val="0"/>
+        <w:rPr>
+          <w:rFonts w:ascii="Lucida Console" w:hAnsi="Lucida Console" w:cs="Lucida Console"/>
+          <w:kern w:val="0"/>
+          <w:sz w:val="18"/>
+          <w:szCs w:val="18"/>
+        </w:rPr>
+      </w:pPr>
+      <w:r>
+        <w:rPr>
+          <w:rFonts w:ascii="Lucida Console" w:hAnsi="Lucida Console" w:cs="Lucida Console"/>
+          <w:kern w:val="0"/>
+          <w:sz w:val="18"/>
+          <w:szCs w:val="18"/>
+        </w:rPr>
+        <w:t>result/gw.geneanet.org.evechevaleyre.lang=</w:t>
+      </w:r>
+      <w:proofErr w:type="gramStart"/>
+      <w:r>
+        <w:rPr>
+          <w:rFonts w:ascii="Lucida Console" w:hAnsi="Lucida Console" w:cs="Lucida Console"/>
+          <w:kern w:val="0"/>
+          <w:sz w:val="18"/>
+          <w:szCs w:val="18"/>
+        </w:rPr>
+        <w:t>fr.n</w:t>
+      </w:r>
+      <w:proofErr w:type="gramEnd"/>
+      <w:r>
+        <w:rPr>
+          <w:rFonts w:ascii="Lucida Console" w:hAnsi="Lucida Console" w:cs="Lucida Console"/>
+          <w:kern w:val="0"/>
+          <w:sz w:val="18"/>
+          <w:szCs w:val="18"/>
+        </w:rPr>
+        <w:t xml:space="preserve">=brincat.oc=0.p=maria+anna.log:[geneanet] DEBUG: </w:t>
+      </w:r>
+      <w:proofErr w:type="spellStart"/>
+      <w:r>
+        <w:rPr>
+          <w:rFonts w:ascii="Lucida Console" w:hAnsi="Lucida Console" w:cs="Lucida Console"/>
+          <w:kern w:val="0"/>
+          <w:sz w:val="18"/>
+          <w:szCs w:val="18"/>
+        </w:rPr>
+        <w:t>Generation</w:t>
+      </w:r>
+      <w:proofErr w:type="spellEnd"/>
+      <w:r>
+        <w:rPr>
+          <w:rFonts w:ascii="Lucida Console" w:hAnsi="Lucida Console" w:cs="Lucida Console"/>
+          <w:kern w:val="0"/>
+          <w:sz w:val="18"/>
+          <w:szCs w:val="18"/>
+        </w:rPr>
+        <w:t xml:space="preserve"> 4, </w:t>
+      </w:r>
+      <w:proofErr w:type="spellStart"/>
+      <w:r>
+        <w:rPr>
+          <w:rFonts w:ascii="Lucida Console" w:hAnsi="Lucida Console" w:cs="Lucida Console"/>
+          <w:kern w:val="0"/>
+          <w:sz w:val="18"/>
+          <w:szCs w:val="18"/>
+        </w:rPr>
+        <w:t>sosa</w:t>
+      </w:r>
+      <w:proofErr w:type="spellEnd"/>
+      <w:r>
+        <w:rPr>
+          <w:rFonts w:ascii="Lucida Console" w:hAnsi="Lucida Console" w:cs="Lucida Console"/>
+          <w:kern w:val="0"/>
+          <w:sz w:val="18"/>
+          <w:szCs w:val="18"/>
+        </w:rPr>
+        <w:t xml:space="preserve"> 8 : Francesco de BRINCAT : note 1 : </w:t>
+      </w:r>
+      <w:proofErr w:type="spellStart"/>
+      <w:r>
+        <w:rPr>
+          <w:rFonts w:ascii="Lucida Console" w:hAnsi="Lucida Console" w:cs="Lucida Console"/>
+          <w:kern w:val="0"/>
+          <w:sz w:val="18"/>
+          <w:szCs w:val="18"/>
+        </w:rPr>
+        <w:t>note_type</w:t>
+      </w:r>
+      <w:proofErr w:type="spellEnd"/>
+      <w:r>
+        <w:rPr>
+          <w:rFonts w:ascii="Lucida Console" w:hAnsi="Lucida Console" w:cs="Lucida Console"/>
+          <w:kern w:val="0"/>
+          <w:sz w:val="18"/>
+          <w:szCs w:val="18"/>
+        </w:rPr>
+        <w:t xml:space="preserve">='Notes individuelles' </w:t>
+      </w:r>
+      <w:proofErr w:type="spellStart"/>
+      <w:r>
+        <w:rPr>
+          <w:rFonts w:ascii="Lucida Console" w:hAnsi="Lucida Console" w:cs="Lucida Console"/>
+          <w:kern w:val="0"/>
+          <w:sz w:val="18"/>
+          <w:szCs w:val="18"/>
+        </w:rPr>
+        <w:t>note_text</w:t>
+      </w:r>
+      <w:proofErr w:type="spellEnd"/>
+      <w:r>
+        <w:rPr>
+          <w:rFonts w:ascii="Lucida Console" w:hAnsi="Lucida Console" w:cs="Lucida Console"/>
+          <w:kern w:val="0"/>
+          <w:sz w:val="18"/>
+          <w:szCs w:val="18"/>
+        </w:rPr>
+        <w:t>=''</w:t>
+      </w:r>
+    </w:p>
+    <w:p>
+      <w:pPr>
+        <w:autoSpaceDE w:val="0"/>
+        <w:autoSpaceDN w:val="0"/>
+        <w:adjustRightInd w:val="0"/>
+        <w:rPr>
+          <w:rFonts w:ascii="Lucida Console" w:hAnsi="Lucida Console" w:cs="Lucida Console"/>
+          <w:kern w:val="0"/>
+          <w:sz w:val="18"/>
+          <w:szCs w:val="18"/>
+        </w:rPr>
+      </w:pPr>
+      <w:r>
+        <w:rPr>
+          <w:rFonts w:ascii="Lucida Console" w:hAnsi="Lucida Console" w:cs="Lucida Console"/>
+          <w:kern w:val="0"/>
+          <w:sz w:val="18"/>
+          <w:szCs w:val="18"/>
+        </w:rPr>
+        <w:t>result/gw.geneanet.org.nraibaut2.lang=fr.n=</w:t>
+      </w:r>
+      <w:proofErr w:type="gramStart"/>
+      <w:r>
+        <w:rPr>
+          <w:rFonts w:ascii="Lucida Console" w:hAnsi="Lucida Console" w:cs="Lucida Console"/>
+          <w:kern w:val="0"/>
+          <w:sz w:val="18"/>
+          <w:szCs w:val="18"/>
+        </w:rPr>
+        <w:t>dupont.oc=0.p</w:t>
+      </w:r>
+      <w:proofErr w:type="gramEnd"/>
+      <w:r>
+        <w:rPr>
+          <w:rFonts w:ascii="Lucida Console" w:hAnsi="Lucida Console" w:cs="Lucida Console"/>
+          <w:kern w:val="0"/>
+          <w:sz w:val="18"/>
+          <w:szCs w:val="18"/>
+        </w:rPr>
+        <w:t xml:space="preserve">=gerard.log:[geneanet] DEBUG: </w:t>
+      </w:r>
+      <w:proofErr w:type="spellStart"/>
+      <w:r>
+        <w:rPr>
+          <w:rFonts w:ascii="Lucida Console" w:hAnsi="Lucida Console" w:cs="Lucida Console"/>
+          <w:kern w:val="0"/>
+          <w:sz w:val="18"/>
+          <w:szCs w:val="18"/>
+        </w:rPr>
+        <w:t>Generation</w:t>
+      </w:r>
+      <w:proofErr w:type="spellEnd"/>
+      <w:r>
+        <w:rPr>
+          <w:rFonts w:ascii="Lucida Console" w:hAnsi="Lucida Console" w:cs="Lucida Console"/>
+          <w:kern w:val="0"/>
+          <w:sz w:val="18"/>
+          <w:szCs w:val="18"/>
+        </w:rPr>
+        <w:t xml:space="preserve"> 1, </w:t>
+      </w:r>
+      <w:proofErr w:type="spellStart"/>
+      <w:r>
+        <w:rPr>
+          <w:rFonts w:ascii="Lucida Console" w:hAnsi="Lucida Console" w:cs="Lucida Console"/>
+          <w:kern w:val="0"/>
+          <w:sz w:val="18"/>
+          <w:szCs w:val="18"/>
+        </w:rPr>
+        <w:t>sosa</w:t>
+      </w:r>
+      <w:proofErr w:type="spellEnd"/>
+      <w:r>
+        <w:rPr>
+          <w:rFonts w:ascii="Lucida Console" w:hAnsi="Lucida Console" w:cs="Lucida Console"/>
+          <w:kern w:val="0"/>
+          <w:sz w:val="18"/>
+          <w:szCs w:val="18"/>
+        </w:rPr>
+        <w:t xml:space="preserve"> 1 : Gérard DUPONT : note 1 : </w:t>
+      </w:r>
+      <w:proofErr w:type="spellStart"/>
+      <w:r>
+        <w:rPr>
+          <w:rFonts w:ascii="Lucida Console" w:hAnsi="Lucida Console" w:cs="Lucida Console"/>
+          <w:kern w:val="0"/>
+          <w:sz w:val="18"/>
+          <w:szCs w:val="18"/>
+        </w:rPr>
+        <w:t>note_type</w:t>
+      </w:r>
+      <w:proofErr w:type="spellEnd"/>
+      <w:r>
+        <w:rPr>
+          <w:rFonts w:ascii="Lucida Console" w:hAnsi="Lucida Console" w:cs="Lucida Console"/>
+          <w:kern w:val="0"/>
+          <w:sz w:val="18"/>
+          <w:szCs w:val="18"/>
+        </w:rPr>
+        <w:t xml:space="preserve">='Notes individuelles' </w:t>
+      </w:r>
+      <w:proofErr w:type="spellStart"/>
+      <w:r>
+        <w:rPr>
+          <w:rFonts w:ascii="Lucida Console" w:hAnsi="Lucida Console" w:cs="Lucida Console"/>
+          <w:kern w:val="0"/>
+          <w:sz w:val="18"/>
+          <w:szCs w:val="18"/>
+        </w:rPr>
+        <w:t>note_text</w:t>
+      </w:r>
+      <w:proofErr w:type="spellEnd"/>
+      <w:r>
+        <w:rPr>
+          <w:rFonts w:ascii="Lucida Console" w:hAnsi="Lucida Console" w:cs="Lucida Console"/>
+          <w:kern w:val="0"/>
+          <w:sz w:val="18"/>
+          <w:szCs w:val="18"/>
+        </w:rPr>
+        <w:t>=''</w:t>
+      </w:r>
+    </w:p>
+    <w:p>
+      <w:pPr>
+        <w:autoSpaceDE w:val="0"/>
+        <w:autoSpaceDN w:val="0"/>
+        <w:adjustRightInd w:val="0"/>
+        <w:rPr>
+          <w:rFonts w:ascii="Lucida Console" w:hAnsi="Lucida Console" w:cs="Lucida Console"/>
+          <w:kern w:val="0"/>
+          <w:sz w:val="18"/>
+          <w:szCs w:val="18"/>
+        </w:rPr>
+      </w:pPr>
+      <w:r>
+        <w:rPr>
+          <w:rFonts w:ascii="Lucida Console" w:hAnsi="Lucida Console" w:cs="Lucida Console"/>
+          <w:kern w:val="0"/>
+          <w:sz w:val="18"/>
+          <w:szCs w:val="18"/>
+        </w:rPr>
+        <w:t>result/gw.geneanet.org.nraibaut2.lang=fr.n=</w:t>
+      </w:r>
+      <w:proofErr w:type="gramStart"/>
+      <w:r>
+        <w:rPr>
+          <w:rFonts w:ascii="Lucida Console" w:hAnsi="Lucida Console" w:cs="Lucida Console"/>
+          <w:kern w:val="0"/>
+          <w:sz w:val="18"/>
+          <w:szCs w:val="18"/>
+        </w:rPr>
+        <w:t>dupont.oc=0.p</w:t>
+      </w:r>
+      <w:proofErr w:type="gramEnd"/>
+      <w:r>
+        <w:rPr>
+          <w:rFonts w:ascii="Lucida Console" w:hAnsi="Lucida Console" w:cs="Lucida Console"/>
+          <w:kern w:val="0"/>
+          <w:sz w:val="18"/>
+          <w:szCs w:val="18"/>
+        </w:rPr>
+        <w:t xml:space="preserve">=gerard.log:[geneanet] DEBUG: </w:t>
+      </w:r>
+      <w:proofErr w:type="spellStart"/>
+      <w:r>
+        <w:rPr>
+          <w:rFonts w:ascii="Lucida Console" w:hAnsi="Lucida Console" w:cs="Lucida Console"/>
+          <w:kern w:val="0"/>
+          <w:sz w:val="18"/>
+          <w:szCs w:val="18"/>
+        </w:rPr>
+        <w:t>Generation</w:t>
+      </w:r>
+      <w:proofErr w:type="spellEnd"/>
+      <w:r>
+        <w:rPr>
+          <w:rFonts w:ascii="Lucida Console" w:hAnsi="Lucida Console" w:cs="Lucida Console"/>
+          <w:kern w:val="0"/>
+          <w:sz w:val="18"/>
+          <w:szCs w:val="18"/>
+        </w:rPr>
+        <w:t xml:space="preserve"> 3, </w:t>
+      </w:r>
+      <w:proofErr w:type="spellStart"/>
+      <w:r>
+        <w:rPr>
+          <w:rFonts w:ascii="Lucida Console" w:hAnsi="Lucida Console" w:cs="Lucida Console"/>
+          <w:kern w:val="0"/>
+          <w:sz w:val="18"/>
+          <w:szCs w:val="18"/>
+        </w:rPr>
+        <w:t>sosa</w:t>
+      </w:r>
+      <w:proofErr w:type="spellEnd"/>
+      <w:r>
+        <w:rPr>
+          <w:rFonts w:ascii="Lucida Console" w:hAnsi="Lucida Console" w:cs="Lucida Console"/>
+          <w:kern w:val="0"/>
+          <w:sz w:val="18"/>
+          <w:szCs w:val="18"/>
+        </w:rPr>
+        <w:t xml:space="preserve"> 4 : Jean DATES : note 1 : </w:t>
+      </w:r>
+      <w:proofErr w:type="spellStart"/>
+      <w:r>
+        <w:rPr>
+          <w:rFonts w:ascii="Lucida Console" w:hAnsi="Lucida Console" w:cs="Lucida Console"/>
+          <w:kern w:val="0"/>
+          <w:sz w:val="18"/>
+          <w:szCs w:val="18"/>
+        </w:rPr>
+        <w:t>note_type</w:t>
+      </w:r>
+      <w:proofErr w:type="spellEnd"/>
+      <w:r>
+        <w:rPr>
+          <w:rFonts w:ascii="Lucida Console" w:hAnsi="Lucida Console" w:cs="Lucida Console"/>
+          <w:kern w:val="0"/>
+          <w:sz w:val="18"/>
+          <w:szCs w:val="18"/>
+        </w:rPr>
+        <w:t xml:space="preserve">='Notes individuelles' </w:t>
+      </w:r>
+      <w:proofErr w:type="spellStart"/>
+      <w:r>
+        <w:rPr>
+          <w:rFonts w:ascii="Lucida Console" w:hAnsi="Lucida Console" w:cs="Lucida Console"/>
+          <w:kern w:val="0"/>
+          <w:sz w:val="18"/>
+          <w:szCs w:val="18"/>
+        </w:rPr>
+        <w:t>note_text</w:t>
+      </w:r>
+      <w:proofErr w:type="spellEnd"/>
+      <w:r>
+        <w:rPr>
+          <w:rFonts w:ascii="Lucida Console" w:hAnsi="Lucida Console" w:cs="Lucida Console"/>
+          <w:kern w:val="0"/>
+          <w:sz w:val="18"/>
+          <w:szCs w:val="18"/>
+        </w:rPr>
+        <w:t>=''</w:t>
+      </w:r>
+    </w:p>
+    <w:p/>
+    <w:p/>
+    <w:bookmarkEnd w:id="1"/>
+    <w:p/>
+    <w:p/>
+    <w:p/>
+    <w:p>
+      <w:pPr>
+        <w:autoSpaceDE w:val="0"/>
+        <w:autoSpaceDN w:val="0"/>
+        <w:adjustRightInd w:val="0"/>
+        <w:rPr>
+          <w:rFonts w:ascii="Lucida Console" w:hAnsi="Lucida Console" w:cs="Lucida Console"/>
+          <w:kern w:val="0"/>
+          <w:sz w:val="18"/>
+          <w:szCs w:val="18"/>
+        </w:rPr>
+      </w:pPr>
+      <w:proofErr w:type="spellStart"/>
+      <w:proofErr w:type="gramStart"/>
+      <w:r>
+        <w:rPr>
+          <w:rFonts w:ascii="Lucida Console" w:hAnsi="Lucida Console" w:cs="Lucida Console"/>
+          <w:kern w:val="0"/>
+          <w:sz w:val="18"/>
+          <w:szCs w:val="18"/>
+        </w:rPr>
+        <w:t>egrep</w:t>
+      </w:r>
+      <w:proofErr w:type="spellEnd"/>
+      <w:proofErr w:type="gramEnd"/>
+      <w:r>
+        <w:rPr>
+          <w:rFonts w:ascii="Lucida Console" w:hAnsi="Lucida Console" w:cs="Lucida Console"/>
+          <w:kern w:val="0"/>
+          <w:sz w:val="18"/>
+          <w:szCs w:val="18"/>
+        </w:rPr>
+        <w:t xml:space="preserve"> 'Notes individuelles' </w:t>
+      </w:r>
+      <w:proofErr w:type="spellStart"/>
+      <w:r>
+        <w:rPr>
+          <w:rFonts w:ascii="Lucida Console" w:hAnsi="Lucida Console" w:cs="Lucida Console"/>
+          <w:kern w:val="0"/>
+          <w:sz w:val="18"/>
+          <w:szCs w:val="18"/>
+        </w:rPr>
+        <w:t>result</w:t>
+      </w:r>
+      <w:proofErr w:type="spellEnd"/>
+      <w:r>
+        <w:rPr>
+          <w:rFonts w:ascii="Lucida Console" w:hAnsi="Lucida Console" w:cs="Lucida Console"/>
+          <w:kern w:val="0"/>
+          <w:sz w:val="18"/>
+          <w:szCs w:val="18"/>
+        </w:rPr>
+        <w:t>/*.log</w:t>
+      </w:r>
+    </w:p>
+    <w:p>
+      <w:pPr>
+        <w:autoSpaceDE w:val="0"/>
+        <w:autoSpaceDN w:val="0"/>
+        <w:adjustRightInd w:val="0"/>
+        <w:rPr>
+          <w:rFonts w:ascii="Lucida Console" w:hAnsi="Lucida Console" w:cs="Lucida Console"/>
+          <w:kern w:val="0"/>
+          <w:sz w:val="18"/>
+          <w:szCs w:val="18"/>
+        </w:rPr>
+      </w:pPr>
+      <w:r>
+        <w:rPr>
+          <w:rFonts w:ascii="Lucida Console" w:hAnsi="Lucida Console" w:cs="Lucida Console"/>
+          <w:kern w:val="0"/>
+          <w:sz w:val="18"/>
+          <w:szCs w:val="18"/>
+        </w:rPr>
+        <w:t>result/gw.geneanet.org.danielr13.lang=fr.n=</w:t>
+      </w:r>
+      <w:proofErr w:type="gramStart"/>
+      <w:r>
+        <w:rPr>
+          <w:rFonts w:ascii="Lucida Console" w:hAnsi="Lucida Console" w:cs="Lucida Console"/>
+          <w:kern w:val="0"/>
+          <w:sz w:val="18"/>
+          <w:szCs w:val="18"/>
+        </w:rPr>
+        <w:t>nicolas.oc=0.p</w:t>
+      </w:r>
+      <w:proofErr w:type="gramEnd"/>
+      <w:r>
+        <w:rPr>
+          <w:rFonts w:ascii="Lucida Console" w:hAnsi="Lucida Console" w:cs="Lucida Console"/>
+          <w:kern w:val="0"/>
+          <w:sz w:val="18"/>
+          <w:szCs w:val="18"/>
+        </w:rPr>
+        <w:t xml:space="preserve">=etienne+henri.log:[geneanet] DEBUG: </w:t>
+      </w:r>
+      <w:proofErr w:type="spellStart"/>
+      <w:r>
+        <w:rPr>
+          <w:rFonts w:ascii="Lucida Console" w:hAnsi="Lucida Console" w:cs="Lucida Console"/>
+          <w:kern w:val="0"/>
+          <w:sz w:val="18"/>
+          <w:szCs w:val="18"/>
+        </w:rPr>
+        <w:t>Generation</w:t>
+      </w:r>
+      <w:proofErr w:type="spellEnd"/>
+      <w:r>
+        <w:rPr>
+          <w:rFonts w:ascii="Lucida Console" w:hAnsi="Lucida Console" w:cs="Lucida Console"/>
+          <w:kern w:val="0"/>
+          <w:sz w:val="18"/>
+          <w:szCs w:val="18"/>
+        </w:rPr>
+        <w:t xml:space="preserve"> 8, </w:t>
+      </w:r>
+      <w:proofErr w:type="spellStart"/>
+      <w:r>
+        <w:rPr>
+          <w:rFonts w:ascii="Lucida Console" w:hAnsi="Lucida Console" w:cs="Lucida Console"/>
+          <w:kern w:val="0"/>
+          <w:sz w:val="18"/>
+          <w:szCs w:val="18"/>
+        </w:rPr>
+        <w:t>sosa</w:t>
+      </w:r>
+      <w:proofErr w:type="spellEnd"/>
+      <w:r>
+        <w:rPr>
+          <w:rFonts w:ascii="Lucida Console" w:hAnsi="Lucida Console" w:cs="Lucida Console"/>
+          <w:kern w:val="0"/>
+          <w:sz w:val="18"/>
+          <w:szCs w:val="18"/>
+        </w:rPr>
+        <w:t xml:space="preserve"> 146 : Jean Baptiste BOSC : note 1 : </w:t>
+      </w:r>
+      <w:proofErr w:type="spellStart"/>
+      <w:r>
+        <w:rPr>
+          <w:rFonts w:ascii="Lucida Console" w:hAnsi="Lucida Console" w:cs="Lucida Console"/>
+          <w:kern w:val="0"/>
+          <w:sz w:val="18"/>
+          <w:szCs w:val="18"/>
+        </w:rPr>
+        <w:t>note_type</w:t>
+      </w:r>
+      <w:proofErr w:type="spellEnd"/>
+      <w:r>
+        <w:rPr>
+          <w:rFonts w:ascii="Lucida Console" w:hAnsi="Lucida Console" w:cs="Lucida Console"/>
+          <w:kern w:val="0"/>
+          <w:sz w:val="18"/>
+          <w:szCs w:val="18"/>
+        </w:rPr>
+        <w:t xml:space="preserve">='Notes individuelles' </w:t>
+      </w:r>
+      <w:proofErr w:type="spellStart"/>
+      <w:r>
+        <w:rPr>
+          <w:rFonts w:ascii="Lucida Console" w:hAnsi="Lucida Console" w:cs="Lucida Console"/>
+          <w:kern w:val="0"/>
+          <w:sz w:val="18"/>
+          <w:szCs w:val="18"/>
+        </w:rPr>
+        <w:t>note_text</w:t>
+      </w:r>
+      <w:proofErr w:type="spellEnd"/>
+      <w:r>
+        <w:rPr>
+          <w:rFonts w:ascii="Lucida Console" w:hAnsi="Lucida Console" w:cs="Lucida Console"/>
+          <w:kern w:val="0"/>
+          <w:sz w:val="18"/>
+          <w:szCs w:val="18"/>
+        </w:rPr>
+        <w:t>='Aveugle'</w:t>
+      </w:r>
+    </w:p>
+    <w:p>
+      <w:pPr>
+        <w:autoSpaceDE w:val="0"/>
+        <w:autoSpaceDN w:val="0"/>
+        <w:adjustRightInd w:val="0"/>
+        <w:rPr>
+          <w:rFonts w:ascii="Lucida Console" w:hAnsi="Lucida Console" w:cs="Lucida Console"/>
+          <w:kern w:val="0"/>
+          <w:sz w:val="18"/>
+          <w:szCs w:val="18"/>
+        </w:rPr>
+      </w:pPr>
+      <w:r>
+        <w:rPr>
+          <w:rFonts w:ascii="Lucida Console" w:hAnsi="Lucida Console" w:cs="Lucida Console"/>
+          <w:kern w:val="0"/>
+          <w:sz w:val="18"/>
+          <w:szCs w:val="18"/>
+        </w:rPr>
+        <w:t>result/gw.geneanet.org.danielr13.lang=fr.n=</w:t>
+      </w:r>
+      <w:proofErr w:type="gramStart"/>
+      <w:r>
+        <w:rPr>
+          <w:rFonts w:ascii="Lucida Console" w:hAnsi="Lucida Console" w:cs="Lucida Console"/>
+          <w:kern w:val="0"/>
+          <w:sz w:val="18"/>
+          <w:szCs w:val="18"/>
+        </w:rPr>
+        <w:t>nicolas.oc=0.p</w:t>
+      </w:r>
+      <w:proofErr w:type="gramEnd"/>
+      <w:r>
+        <w:rPr>
+          <w:rFonts w:ascii="Lucida Console" w:hAnsi="Lucida Console" w:cs="Lucida Console"/>
+          <w:kern w:val="0"/>
+          <w:sz w:val="18"/>
+          <w:szCs w:val="18"/>
+        </w:rPr>
+        <w:t xml:space="preserve">=etienne+henri.log:[geneanet] DEBUG: </w:t>
+      </w:r>
+      <w:proofErr w:type="spellStart"/>
+      <w:r>
+        <w:rPr>
+          <w:rFonts w:ascii="Lucida Console" w:hAnsi="Lucida Console" w:cs="Lucida Console"/>
+          <w:kern w:val="0"/>
+          <w:sz w:val="18"/>
+          <w:szCs w:val="18"/>
+        </w:rPr>
+        <w:t>Generation</w:t>
+      </w:r>
+      <w:proofErr w:type="spellEnd"/>
+      <w:r>
+        <w:rPr>
+          <w:rFonts w:ascii="Lucida Console" w:hAnsi="Lucida Console" w:cs="Lucida Console"/>
+          <w:kern w:val="0"/>
+          <w:sz w:val="18"/>
+          <w:szCs w:val="18"/>
+        </w:rPr>
+        <w:t xml:space="preserve"> 9, </w:t>
+      </w:r>
+      <w:proofErr w:type="spellStart"/>
+      <w:r>
+        <w:rPr>
+          <w:rFonts w:ascii="Lucida Console" w:hAnsi="Lucida Console" w:cs="Lucida Console"/>
+          <w:kern w:val="0"/>
+          <w:sz w:val="18"/>
+          <w:szCs w:val="18"/>
+        </w:rPr>
+        <w:t>sosa</w:t>
+      </w:r>
+      <w:proofErr w:type="spellEnd"/>
+      <w:r>
+        <w:rPr>
+          <w:rFonts w:ascii="Lucida Console" w:hAnsi="Lucida Console" w:cs="Lucida Console"/>
+          <w:kern w:val="0"/>
+          <w:sz w:val="18"/>
+          <w:szCs w:val="18"/>
+        </w:rPr>
+        <w:t xml:space="preserve"> 307 : Anne BARD : note 1 : </w:t>
+      </w:r>
+      <w:proofErr w:type="spellStart"/>
+      <w:r>
+        <w:rPr>
+          <w:rFonts w:ascii="Lucida Console" w:hAnsi="Lucida Console" w:cs="Lucida Console"/>
+          <w:kern w:val="0"/>
+          <w:sz w:val="18"/>
+          <w:szCs w:val="18"/>
+        </w:rPr>
+        <w:t>note_type</w:t>
+      </w:r>
+      <w:proofErr w:type="spellEnd"/>
+      <w:r>
+        <w:rPr>
+          <w:rFonts w:ascii="Lucida Console" w:hAnsi="Lucida Console" w:cs="Lucida Console"/>
+          <w:kern w:val="0"/>
+          <w:sz w:val="18"/>
+          <w:szCs w:val="18"/>
+        </w:rPr>
+        <w:t xml:space="preserve">='Notes individuelles' </w:t>
+      </w:r>
+      <w:proofErr w:type="spellStart"/>
+      <w:r>
+        <w:rPr>
+          <w:rFonts w:ascii="Lucida Console" w:hAnsi="Lucida Console" w:cs="Lucida Console"/>
+          <w:kern w:val="0"/>
+          <w:sz w:val="18"/>
+          <w:szCs w:val="18"/>
+        </w:rPr>
+        <w:t>note_text</w:t>
+      </w:r>
+      <w:proofErr w:type="spellEnd"/>
+      <w:r>
+        <w:rPr>
+          <w:rFonts w:ascii="Lucida Console" w:hAnsi="Lucida Console" w:cs="Lucida Console"/>
+          <w:kern w:val="0"/>
+          <w:sz w:val="18"/>
+          <w:szCs w:val="18"/>
+        </w:rPr>
+        <w:t xml:space="preserve">='"morte d'un </w:t>
+      </w:r>
+      <w:proofErr w:type="spellStart"/>
+      <w:r>
+        <w:rPr>
+          <w:rFonts w:ascii="Lucida Console" w:hAnsi="Lucida Console" w:cs="Lucida Console"/>
+          <w:kern w:val="0"/>
+          <w:sz w:val="18"/>
+          <w:szCs w:val="18"/>
+        </w:rPr>
+        <w:t>coléra</w:t>
+      </w:r>
+      <w:proofErr w:type="spellEnd"/>
+      <w:r>
+        <w:rPr>
+          <w:rFonts w:ascii="Lucida Console" w:hAnsi="Lucida Console" w:cs="Lucida Console"/>
+          <w:kern w:val="0"/>
+          <w:sz w:val="18"/>
+          <w:szCs w:val="18"/>
+        </w:rPr>
+        <w:t xml:space="preserve"> morbus"'</w:t>
+      </w:r>
+    </w:p>
+    <w:p>
+      <w:pPr>
+        <w:autoSpaceDE w:val="0"/>
+        <w:autoSpaceDN w:val="0"/>
+        <w:adjustRightInd w:val="0"/>
+        <w:rPr>
+          <w:rFonts w:ascii="Lucida Console" w:hAnsi="Lucida Console" w:cs="Lucida Console"/>
+          <w:kern w:val="0"/>
+          <w:sz w:val="18"/>
+          <w:szCs w:val="18"/>
+        </w:rPr>
+      </w:pPr>
+      <w:r>
+        <w:rPr>
+          <w:rFonts w:ascii="Lucida Console" w:hAnsi="Lucida Console" w:cs="Lucida Console"/>
+          <w:kern w:val="0"/>
+          <w:sz w:val="18"/>
+          <w:szCs w:val="18"/>
+        </w:rPr>
+        <w:t>result/gw.geneanet.org.evechevaleyre.lang=</w:t>
+      </w:r>
+      <w:proofErr w:type="gramStart"/>
+      <w:r>
+        <w:rPr>
+          <w:rFonts w:ascii="Lucida Console" w:hAnsi="Lucida Console" w:cs="Lucida Console"/>
+          <w:kern w:val="0"/>
+          <w:sz w:val="18"/>
+          <w:szCs w:val="18"/>
+        </w:rPr>
+        <w:t>fr.n</w:t>
+      </w:r>
+      <w:proofErr w:type="gramEnd"/>
+      <w:r>
+        <w:rPr>
+          <w:rFonts w:ascii="Lucida Console" w:hAnsi="Lucida Console" w:cs="Lucida Console"/>
+          <w:kern w:val="0"/>
+          <w:sz w:val="18"/>
+          <w:szCs w:val="18"/>
+        </w:rPr>
+        <w:t xml:space="preserve">=brincat.oc=0.p=maria+anna.log:[geneanet] DEBUG: </w:t>
+      </w:r>
+      <w:proofErr w:type="spellStart"/>
+      <w:r>
+        <w:rPr>
+          <w:rFonts w:ascii="Lucida Console" w:hAnsi="Lucida Console" w:cs="Lucida Console"/>
+          <w:kern w:val="0"/>
+          <w:sz w:val="18"/>
+          <w:szCs w:val="18"/>
+        </w:rPr>
+        <w:t>Generation</w:t>
+      </w:r>
+      <w:proofErr w:type="spellEnd"/>
+      <w:r>
+        <w:rPr>
+          <w:rFonts w:ascii="Lucida Console" w:hAnsi="Lucida Console" w:cs="Lucida Console"/>
+          <w:kern w:val="0"/>
+          <w:sz w:val="18"/>
+          <w:szCs w:val="18"/>
+        </w:rPr>
+        <w:t xml:space="preserve"> 4, </w:t>
+      </w:r>
+      <w:proofErr w:type="spellStart"/>
+      <w:r>
+        <w:rPr>
+          <w:rFonts w:ascii="Lucida Console" w:hAnsi="Lucida Console" w:cs="Lucida Console"/>
+          <w:kern w:val="0"/>
+          <w:sz w:val="18"/>
+          <w:szCs w:val="18"/>
+        </w:rPr>
+        <w:t>sosa</w:t>
+      </w:r>
+      <w:proofErr w:type="spellEnd"/>
+      <w:r>
+        <w:rPr>
+          <w:rFonts w:ascii="Lucida Console" w:hAnsi="Lucida Console" w:cs="Lucida Console"/>
+          <w:kern w:val="0"/>
+          <w:sz w:val="18"/>
+          <w:szCs w:val="18"/>
+        </w:rPr>
+        <w:t xml:space="preserve"> 8 : Francesco de BRINCAT : note 1 : </w:t>
+      </w:r>
+      <w:proofErr w:type="spellStart"/>
+      <w:r>
+        <w:rPr>
+          <w:rFonts w:ascii="Lucida Console" w:hAnsi="Lucida Console" w:cs="Lucida Console"/>
+          <w:kern w:val="0"/>
+          <w:sz w:val="18"/>
+          <w:szCs w:val="18"/>
+        </w:rPr>
+        <w:t>note_type</w:t>
+      </w:r>
+      <w:proofErr w:type="spellEnd"/>
+      <w:r>
+        <w:rPr>
+          <w:rFonts w:ascii="Lucida Console" w:hAnsi="Lucida Console" w:cs="Lucida Console"/>
+          <w:kern w:val="0"/>
+          <w:sz w:val="18"/>
+          <w:szCs w:val="18"/>
+        </w:rPr>
+        <w:t xml:space="preserve">='Notes individuelles' </w:t>
+      </w:r>
+      <w:proofErr w:type="spellStart"/>
+      <w:r>
+        <w:rPr>
+          <w:rFonts w:ascii="Lucida Console" w:hAnsi="Lucida Console" w:cs="Lucida Console"/>
+          <w:kern w:val="0"/>
+          <w:sz w:val="18"/>
+          <w:szCs w:val="18"/>
+        </w:rPr>
+        <w:t>note_text</w:t>
+      </w:r>
+      <w:proofErr w:type="spellEnd"/>
+      <w:r>
+        <w:rPr>
+          <w:rFonts w:ascii="Lucida Console" w:hAnsi="Lucida Console" w:cs="Lucida Console"/>
+          <w:kern w:val="0"/>
+          <w:sz w:val="18"/>
+          <w:szCs w:val="18"/>
+        </w:rPr>
+        <w:t xml:space="preserve">='son père est nommé BRINCAT Gioacchino </w:t>
+      </w:r>
+      <w:proofErr w:type="spellStart"/>
+      <w:r>
+        <w:rPr>
+          <w:rFonts w:ascii="Lucida Console" w:hAnsi="Lucida Console" w:cs="Lucida Console"/>
+          <w:kern w:val="0"/>
+          <w:sz w:val="18"/>
+          <w:szCs w:val="18"/>
+        </w:rPr>
+        <w:t>Verifier</w:t>
+      </w:r>
+      <w:proofErr w:type="spellEnd"/>
+      <w:r>
+        <w:rPr>
+          <w:rFonts w:ascii="Lucida Console" w:hAnsi="Lucida Console" w:cs="Lucida Console"/>
+          <w:kern w:val="0"/>
+          <w:sz w:val="18"/>
+          <w:szCs w:val="18"/>
+        </w:rPr>
+        <w:t xml:space="preserve"> la parenté'</w:t>
+      </w:r>
+    </w:p>
+    <w:p>
+      <w:pPr>
+        <w:autoSpaceDE w:val="0"/>
+        <w:autoSpaceDN w:val="0"/>
+        <w:adjustRightInd w:val="0"/>
+        <w:rPr>
+          <w:rFonts w:ascii="Lucida Console" w:hAnsi="Lucida Console" w:cs="Lucida Console"/>
+          <w:kern w:val="0"/>
+          <w:sz w:val="18"/>
+          <w:szCs w:val="18"/>
+        </w:rPr>
+      </w:pPr>
+      <w:r>
+        <w:rPr>
+          <w:rFonts w:ascii="Lucida Console" w:hAnsi="Lucida Console" w:cs="Lucida Console"/>
+          <w:kern w:val="0"/>
+          <w:sz w:val="18"/>
+          <w:szCs w:val="18"/>
+        </w:rPr>
+        <w:t>result/gw.geneanet.org.nraibaut2.lang=fr.n=</w:t>
+      </w:r>
+      <w:proofErr w:type="gramStart"/>
+      <w:r>
+        <w:rPr>
+          <w:rFonts w:ascii="Lucida Console" w:hAnsi="Lucida Console" w:cs="Lucida Console"/>
+          <w:kern w:val="0"/>
+          <w:sz w:val="18"/>
+          <w:szCs w:val="18"/>
+        </w:rPr>
+        <w:t>dupont.oc=0.p</w:t>
+      </w:r>
+      <w:proofErr w:type="gramEnd"/>
+      <w:r>
+        <w:rPr>
+          <w:rFonts w:ascii="Lucida Console" w:hAnsi="Lucida Console" w:cs="Lucida Console"/>
+          <w:kern w:val="0"/>
+          <w:sz w:val="18"/>
+          <w:szCs w:val="18"/>
+        </w:rPr>
+        <w:t xml:space="preserve">=gerard.log:[geneanet] DEBUG: </w:t>
+      </w:r>
+      <w:proofErr w:type="spellStart"/>
+      <w:r>
+        <w:rPr>
+          <w:rFonts w:ascii="Lucida Console" w:hAnsi="Lucida Console" w:cs="Lucida Console"/>
+          <w:kern w:val="0"/>
+          <w:sz w:val="18"/>
+          <w:szCs w:val="18"/>
+        </w:rPr>
+        <w:t>Generation</w:t>
+      </w:r>
+      <w:proofErr w:type="spellEnd"/>
+      <w:r>
+        <w:rPr>
+          <w:rFonts w:ascii="Lucida Console" w:hAnsi="Lucida Console" w:cs="Lucida Console"/>
+          <w:kern w:val="0"/>
+          <w:sz w:val="18"/>
+          <w:szCs w:val="18"/>
+        </w:rPr>
+        <w:t xml:space="preserve"> 1, </w:t>
+      </w:r>
+      <w:proofErr w:type="spellStart"/>
+      <w:r>
+        <w:rPr>
+          <w:rFonts w:ascii="Lucida Console" w:hAnsi="Lucida Console" w:cs="Lucida Console"/>
+          <w:kern w:val="0"/>
+          <w:sz w:val="18"/>
+          <w:szCs w:val="18"/>
+        </w:rPr>
+        <w:t>sosa</w:t>
+      </w:r>
+      <w:proofErr w:type="spellEnd"/>
+      <w:r>
+        <w:rPr>
+          <w:rFonts w:ascii="Lucida Console" w:hAnsi="Lucida Console" w:cs="Lucida Console"/>
+          <w:kern w:val="0"/>
+          <w:sz w:val="18"/>
+          <w:szCs w:val="18"/>
+        </w:rPr>
+        <w:t xml:space="preserve"> 1 : Gérard DUPONT : note 1 : </w:t>
+      </w:r>
+      <w:proofErr w:type="spellStart"/>
+      <w:r>
+        <w:rPr>
+          <w:rFonts w:ascii="Lucida Console" w:hAnsi="Lucida Console" w:cs="Lucida Console"/>
+          <w:kern w:val="0"/>
+          <w:sz w:val="18"/>
+          <w:szCs w:val="18"/>
+        </w:rPr>
+        <w:t>note_type</w:t>
+      </w:r>
+      <w:proofErr w:type="spellEnd"/>
+      <w:r>
+        <w:rPr>
+          <w:rFonts w:ascii="Lucida Console" w:hAnsi="Lucida Console" w:cs="Lucida Console"/>
+          <w:kern w:val="0"/>
+          <w:sz w:val="18"/>
+          <w:szCs w:val="18"/>
+        </w:rPr>
+        <w:t xml:space="preserve">='Notes individuelles' </w:t>
+      </w:r>
+      <w:proofErr w:type="spellStart"/>
+      <w:r>
+        <w:rPr>
+          <w:rFonts w:ascii="Lucida Console" w:hAnsi="Lucida Console" w:cs="Lucida Console"/>
+          <w:kern w:val="0"/>
+          <w:sz w:val="18"/>
+          <w:szCs w:val="18"/>
+        </w:rPr>
+        <w:t>note_text</w:t>
+      </w:r>
+      <w:proofErr w:type="spellEnd"/>
+      <w:r>
+        <w:rPr>
+          <w:rFonts w:ascii="Lucida Console" w:hAnsi="Lucida Console" w:cs="Lucida Console"/>
+          <w:kern w:val="0"/>
+          <w:sz w:val="18"/>
+          <w:szCs w:val="18"/>
+        </w:rPr>
+        <w:t>='Texte1 note général</w:t>
+      </w:r>
+    </w:p>
+    <w:p>
+      <w:pPr>
+        <w:autoSpaceDE w:val="0"/>
+        <w:autoSpaceDN w:val="0"/>
+        <w:adjustRightInd w:val="0"/>
+        <w:rPr>
+          <w:rFonts w:ascii="Lucida Console" w:hAnsi="Lucida Console" w:cs="Lucida Console"/>
+          <w:kern w:val="0"/>
+          <w:sz w:val="18"/>
+          <w:szCs w:val="18"/>
+        </w:rPr>
+      </w:pPr>
+      <w:r>
+        <w:rPr>
+          <w:rFonts w:ascii="Lucida Console" w:hAnsi="Lucida Console" w:cs="Lucida Console"/>
+          <w:kern w:val="0"/>
+          <w:sz w:val="18"/>
+          <w:szCs w:val="18"/>
+        </w:rPr>
+        <w:t>result/gw.geneanet.org.nraibaut2.lang=fr.n=</w:t>
+      </w:r>
+      <w:proofErr w:type="gramStart"/>
+      <w:r>
+        <w:rPr>
+          <w:rFonts w:ascii="Lucida Console" w:hAnsi="Lucida Console" w:cs="Lucida Console"/>
+          <w:kern w:val="0"/>
+          <w:sz w:val="18"/>
+          <w:szCs w:val="18"/>
+        </w:rPr>
+        <w:t>dupont.oc=0.p</w:t>
+      </w:r>
+      <w:proofErr w:type="gramEnd"/>
+      <w:r>
+        <w:rPr>
+          <w:rFonts w:ascii="Lucida Console" w:hAnsi="Lucida Console" w:cs="Lucida Console"/>
+          <w:kern w:val="0"/>
+          <w:sz w:val="18"/>
+          <w:szCs w:val="18"/>
+        </w:rPr>
+        <w:t xml:space="preserve">=gerard.log:[geneanet] DEBUG: </w:t>
+      </w:r>
+      <w:proofErr w:type="spellStart"/>
+      <w:r>
+        <w:rPr>
+          <w:rFonts w:ascii="Lucida Console" w:hAnsi="Lucida Console" w:cs="Lucida Console"/>
+          <w:kern w:val="0"/>
+          <w:sz w:val="18"/>
+          <w:szCs w:val="18"/>
+        </w:rPr>
+        <w:t>Generation</w:t>
+      </w:r>
+      <w:proofErr w:type="spellEnd"/>
+      <w:r>
+        <w:rPr>
+          <w:rFonts w:ascii="Lucida Console" w:hAnsi="Lucida Console" w:cs="Lucida Console"/>
+          <w:kern w:val="0"/>
+          <w:sz w:val="18"/>
+          <w:szCs w:val="18"/>
+        </w:rPr>
+        <w:t xml:space="preserve"> 3, </w:t>
+      </w:r>
+      <w:proofErr w:type="spellStart"/>
+      <w:r>
+        <w:rPr>
+          <w:rFonts w:ascii="Lucida Console" w:hAnsi="Lucida Console" w:cs="Lucida Console"/>
+          <w:kern w:val="0"/>
+          <w:sz w:val="18"/>
+          <w:szCs w:val="18"/>
+        </w:rPr>
+        <w:t>sosa</w:t>
+      </w:r>
+      <w:proofErr w:type="spellEnd"/>
+      <w:r>
+        <w:rPr>
+          <w:rFonts w:ascii="Lucida Console" w:hAnsi="Lucida Console" w:cs="Lucida Console"/>
+          <w:kern w:val="0"/>
+          <w:sz w:val="18"/>
+          <w:szCs w:val="18"/>
+        </w:rPr>
+        <w:t xml:space="preserve"> 4 : Jean DATES : note 1 : </w:t>
+      </w:r>
+      <w:proofErr w:type="spellStart"/>
+      <w:r>
+        <w:rPr>
+          <w:rFonts w:ascii="Lucida Console" w:hAnsi="Lucida Console" w:cs="Lucida Console"/>
+          <w:kern w:val="0"/>
+          <w:sz w:val="18"/>
+          <w:szCs w:val="18"/>
+        </w:rPr>
+        <w:t>note_type</w:t>
+      </w:r>
+      <w:proofErr w:type="spellEnd"/>
+      <w:r>
+        <w:rPr>
+          <w:rFonts w:ascii="Lucida Console" w:hAnsi="Lucida Console" w:cs="Lucida Console"/>
+          <w:kern w:val="0"/>
+          <w:sz w:val="18"/>
+          <w:szCs w:val="18"/>
+        </w:rPr>
+        <w:t xml:space="preserve">='Notes individuelles' </w:t>
+      </w:r>
+      <w:proofErr w:type="spellStart"/>
+      <w:r>
+        <w:rPr>
+          <w:rFonts w:ascii="Lucida Console" w:hAnsi="Lucida Console" w:cs="Lucida Console"/>
+          <w:kern w:val="0"/>
+          <w:sz w:val="18"/>
+          <w:szCs w:val="18"/>
+        </w:rPr>
+        <w:t>note_text</w:t>
+      </w:r>
+      <w:proofErr w:type="spellEnd"/>
+      <w:r>
+        <w:rPr>
+          <w:rFonts w:ascii="Lucida Console" w:hAnsi="Lucida Console" w:cs="Lucida Console"/>
+          <w:kern w:val="0"/>
+          <w:sz w:val="18"/>
+          <w:szCs w:val="18"/>
+        </w:rPr>
+        <w:t>='Retraite:'</w:t>
+      </w:r>
+    </w:p>
+    <w:p/>
+    <w:p>
       <w:pPr>
         <w:spacing w:after="160" w:line="259" w:lineRule="auto"/>
       </w:pPr>
@@ -1770,7 +4151,7 @@
       <w:r>
         <w:t xml:space="preserve">Test initial avec exemple </w:t>
       </w:r>
-      <w:hyperlink r:id="rId8" w:anchor="building-an-example-scrapy-crawler-for-imdb" w:history="1">
+      <w:hyperlink r:id="rId12" w:anchor="building-an-example-scrapy-crawler-for-imdb" w:history="1">
         <w:r>
           <w:rPr>
             <w:rStyle w:val="Lienhypertexte"/>
@@ -1781,7 +4162,7 @@
     </w:p>
     <w:p/>
     <w:p>
-      <w:bookmarkStart w:id="0" w:name="_Hlk142067930"/>
+      <w:bookmarkStart w:id="2" w:name="_Hlk142067930"/>
       <w:proofErr w:type="gramStart"/>
       <w:r>
         <w:t>création</w:t>
@@ -1994,7 +4375,7 @@
         <w:t xml:space="preserve"> example.com</w:t>
       </w:r>
     </w:p>
-    <w:bookmarkEnd w:id="0"/>
+    <w:bookmarkEnd w:id="2"/>
     <w:p/>
     <w:p/>
     <w:p>
@@ -2013,7 +4394,7 @@
       </w:r>
     </w:p>
     <w:p>
-      <w:hyperlink r:id="rId9" w:history="1">
+      <w:hyperlink r:id="rId13" w:history="1">
         <w:r>
           <w:rPr>
             <w:rStyle w:val="Lienhypertexte"/>
@@ -2281,7 +4662,7 @@
       <w:r>
         <w:t xml:space="preserve"> </w:t>
       </w:r>
-      <w:hyperlink r:id="rId10" w:history="1">
+      <w:hyperlink r:id="rId14" w:history="1">
         <w:r>
           <w:rPr>
             <w:rStyle w:val="Lienhypertexte"/>
@@ -4133,7 +6514,7 @@
       <w:r>
         <w:t xml:space="preserve">Tests avec </w:t>
       </w:r>
-      <w:hyperlink r:id="rId11" w:history="1">
+      <w:hyperlink r:id="rId15" w:history="1">
         <w:r>
           <w:rPr>
             <w:rStyle w:val="Lienhypertexte"/>
@@ -7274,7 +9655,7 @@
           <w:rFonts w:eastAsiaTheme="majorEastAsia"/>
         </w:rPr>
       </w:pPr>
-      <w:hyperlink r:id="rId12" w:history="1">
+      <w:hyperlink r:id="rId16" w:history="1">
         <w:r>
           <w:rPr>
             <w:rStyle w:val="Lienhypertexte"/>
@@ -7816,7 +10197,7 @@
       <w:r>
         <w:t xml:space="preserve"> : </w:t>
       </w:r>
-      <w:hyperlink r:id="rId13" w:history="1">
+      <w:hyperlink r:id="rId17" w:history="1">
         <w:r>
           <w:rPr>
             <w:rStyle w:val="Lienhypertexte"/>
@@ -8910,7 +11291,7 @@
       <w:pPr>
         <w:pStyle w:val="Listing"/>
       </w:pPr>
-      <w:hyperlink r:id="rId14" w:history="1">
+      <w:hyperlink r:id="rId18" w:history="1">
         <w:r>
           <w:rPr>
             <w:rStyle w:val="Lienhypertexte"/>
@@ -8947,7 +11328,7 @@
       <w:pPr>
         <w:pStyle w:val="Listing"/>
       </w:pPr>
-      <w:hyperlink r:id="rId15" w:history="1">
+      <w:hyperlink r:id="rId19" w:history="1">
         <w:r>
           <w:rPr>
             <w:rStyle w:val="Lienhypertexte"/>
@@ -9000,7 +11381,7 @@
       <w:pPr>
         <w:pStyle w:val="Listing"/>
       </w:pPr>
-      <w:hyperlink r:id="rId16" w:history="1">
+      <w:hyperlink r:id="rId20" w:history="1">
         <w:r>
           <w:rPr>
             <w:rStyle w:val="Lienhypertexte"/>
@@ -11887,7 +14268,7 @@
     <w:p/>
     <w:p/>
     <w:sectPr>
-      <w:headerReference w:type="default" r:id="rId17"/>
+      <w:headerReference w:type="default" r:id="rId21"/>
       <w:pgSz w:w="16838" w:h="11906" w:orient="landscape"/>
       <w:pgMar w:top="1080" w:right="1440" w:bottom="1080" w:left="1440" w:header="708" w:footer="708" w:gutter="0"/>
       <w:cols w:space="708"/>

</xml_diff>

<commit_message>
Factorisation titre de noblesse / sous-titre
</commit_message>
<xml_diff>
--- a/doc/NotesNRa4_tests.docx
+++ b/doc/NotesNRa4_tests.docx
@@ -14513,6 +14513,16 @@
     <w:p>
       <w:proofErr w:type="gramStart"/>
       <w:r>
+        <w:t>sans</w:t>
+      </w:r>
+      <w:proofErr w:type="gramEnd"/>
+      <w:r>
+        <w:t xml:space="preserve"> titre, mais avec sources qui matchent</w:t>
+      </w:r>
+    </w:p>
+    <w:p>
+      <w:proofErr w:type="gramStart"/>
+      <w:r>
         <w:t>response.xpath</w:t>
       </w:r>
       <w:proofErr w:type="gramEnd"/>
@@ -14594,28 +14604,74 @@
           <w:rPr>
             <w:rStyle w:val="Lienhypertexte"/>
           </w:rPr>
-          <w:t>https://gw.geneanet.org/danielr13?lan</w:t>
+          <w:t>https://gw.geneanet.org/danielr13?lang=fr&amp;p=marthe&amp;n=saint+michel&amp;oc=1</w:t>
         </w:r>
+      </w:hyperlink>
+      <w:r>
+        <w:t>"</w:t>
+      </w:r>
+    </w:p>
+    <w:p/>
+    <w:p>
+      <w:proofErr w:type="spellStart"/>
+      <w:proofErr w:type="gramStart"/>
+      <w:r>
+        <w:t>scrapy</w:t>
+      </w:r>
+      <w:proofErr w:type="spellEnd"/>
+      <w:proofErr w:type="gramEnd"/>
+      <w:r>
+        <w:t xml:space="preserve"> </w:t>
+      </w:r>
+      <w:proofErr w:type="spellStart"/>
+      <w:r>
+        <w:t>shell</w:t>
+      </w:r>
+      <w:proofErr w:type="spellEnd"/>
+      <w:r>
+        <w:t xml:space="preserve"> </w:t>
+      </w:r>
+      <w:r>
+        <w:t>"</w:t>
+      </w:r>
+      <w:hyperlink r:id="rId24" w:history="1">
         <w:r>
           <w:rPr>
             <w:rStyle w:val="Lienhypertexte"/>
+            <w:noProof/>
           </w:rPr>
-          <w:t>g</w:t>
-        </w:r>
-        <w:r>
-          <w:rPr>
-            <w:rStyle w:val="Lienhypertexte"/>
-          </w:rPr>
-          <w:t>=fr&amp;p=marthe&amp;n=saint+michel&amp;oc=1</w:t>
+          <w:t>https://gw.geneanet.org/nraibaut2?lang=fr&amp;n=dupont&amp;oc=0&amp;p=gerard</w:t>
         </w:r>
       </w:hyperlink>
       <w:r>
         <w:t>"</w:t>
       </w:r>
     </w:p>
+    <w:p>
+      <w:pPr>
+        <w:rPr>
+          <w:noProof/>
+        </w:rPr>
+      </w:pPr>
+      <w:proofErr w:type="gramStart"/>
+      <w:r>
+        <w:t>avec</w:t>
+      </w:r>
+      <w:proofErr w:type="gramEnd"/>
+      <w:r>
+        <w:t xml:space="preserve"> titre et note sur</w:t>
+      </w:r>
+      <w:r>
+        <w:t xml:space="preserve"> le</w:t>
+      </w:r>
+      <w:r>
+        <w:t xml:space="preserve"> titre</w:t>
+      </w:r>
+    </w:p>
+    <w:p/>
     <w:p/>
     <w:sectPr>
-      <w:headerReference w:type="default" r:id="rId24"/>
+      <w:headerReference w:type="default" r:id="rId25"/>
       <w:pgSz w:w="16838" w:h="11906" w:orient="landscape"/>
       <w:pgMar w:top="1080" w:right="1440" w:bottom="1080" w:left="1440" w:header="708" w:footer="708" w:gutter="0"/>
       <w:cols w:space="708"/>

</xml_diff>

<commit_message>
Correctifs pour import final
</commit_message>
<xml_diff>
--- a/doc/NotesNRa4_tests.docx
+++ b/doc/NotesNRa4_tests.docx
@@ -158,118 +158,49 @@
       <w:pPr>
         <w:pStyle w:val="PrformatHTML"/>
         <w:rPr>
+          <w:rFonts w:eastAsiaTheme="majorEastAsia"/>
+          <w:highlight w:val="cyan"/>
+        </w:rPr>
+      </w:pPr>
+      <w:proofErr w:type="spellStart"/>
+      <w:proofErr w:type="gramStart"/>
+      <w:r>
+        <w:rPr>
           <w:rStyle w:val="n"/>
           <w:rFonts w:eastAsiaTheme="majorEastAsia"/>
           <w:highlight w:val="cyan"/>
         </w:rPr>
-      </w:pPr>
-      <w:proofErr w:type="spellStart"/>
-      <w:proofErr w:type="gramStart"/>
+        <w:t>scrapy</w:t>
+      </w:r>
+      <w:proofErr w:type="spellEnd"/>
+      <w:proofErr w:type="gramEnd"/>
       <w:r>
         <w:rPr>
           <w:rStyle w:val="n"/>
           <w:rFonts w:eastAsiaTheme="majorEastAsia"/>
           <w:highlight w:val="cyan"/>
         </w:rPr>
-        <w:t>scrapy</w:t>
-      </w:r>
-      <w:proofErr w:type="spellEnd"/>
-      <w:proofErr w:type="gramEnd"/>
+        <w:t xml:space="preserve"> crawl </w:t>
+      </w:r>
+      <w:proofErr w:type="spellStart"/>
       <w:r>
         <w:rPr>
           <w:rStyle w:val="n"/>
           <w:rFonts w:eastAsiaTheme="majorEastAsia"/>
           <w:highlight w:val="cyan"/>
         </w:rPr>
-        <w:t xml:space="preserve"> crawl </w:t>
-      </w:r>
-      <w:proofErr w:type="spellStart"/>
+        <w:t>geneanet</w:t>
+      </w:r>
+      <w:proofErr w:type="spellEnd"/>
       <w:r>
         <w:rPr>
           <w:rStyle w:val="n"/>
           <w:rFonts w:eastAsiaTheme="majorEastAsia"/>
           <w:highlight w:val="cyan"/>
         </w:rPr>
-        <w:t>geneanet</w:t>
-      </w:r>
-      <w:proofErr w:type="spellEnd"/>
-      <w:r>
-        <w:rPr>
-          <w:rStyle w:val="n"/>
-          <w:rFonts w:eastAsiaTheme="majorEastAsia"/>
-          <w:highlight w:val="cyan"/>
-        </w:rPr>
-        <w:t xml:space="preserve"> -a url="https://gw.geneanet.org/nraibaut2</w:t>
-      </w:r>
-      <w:r>
-        <w:rPr>
-          <w:rStyle w:val="n"/>
-          <w:rFonts w:eastAsiaTheme="majorEastAsia"/>
-          <w:b/>
-          <w:bCs/>
-          <w:color w:val="FF0000"/>
-          <w:highlight w:val="yellow"/>
-        </w:rPr>
-        <w:t>_w</w:t>
-      </w:r>
-      <w:r>
-        <w:rPr>
-          <w:rStyle w:val="n"/>
-          <w:rFonts w:eastAsiaTheme="majorEastAsia"/>
-          <w:highlight w:val="cyan"/>
-        </w:rPr>
-        <w:t>?lang=fr&amp;n=dupont&amp;oc=0&amp;p=gerard"</w:t>
-      </w:r>
-    </w:p>
-    <w:p>
-      <w:pPr>
-        <w:pStyle w:val="PrformatHTML"/>
-        <w:rPr>
-          <w:rStyle w:val="n"/>
-          <w:rFonts w:eastAsiaTheme="majorEastAsia"/>
-          <w:highlight w:val="cyan"/>
-        </w:rPr>
-      </w:pPr>
-      <w:proofErr w:type="spellStart"/>
-      <w:proofErr w:type="gramStart"/>
-      <w:r>
-        <w:rPr>
-          <w:rStyle w:val="n"/>
-          <w:rFonts w:eastAsiaTheme="majorEastAsia"/>
-          <w:highlight w:val="cyan"/>
-        </w:rPr>
-        <w:t>scrapy</w:t>
-      </w:r>
-      <w:proofErr w:type="spellEnd"/>
-      <w:proofErr w:type="gramEnd"/>
-      <w:r>
-        <w:rPr>
-          <w:rStyle w:val="n"/>
-          <w:rFonts w:eastAsiaTheme="majorEastAsia"/>
-          <w:highlight w:val="cyan"/>
-        </w:rPr>
-        <w:t xml:space="preserve"> crawl </w:t>
-      </w:r>
-      <w:proofErr w:type="spellStart"/>
-      <w:r>
-        <w:rPr>
-          <w:rStyle w:val="n"/>
-          <w:rFonts w:eastAsiaTheme="majorEastAsia"/>
-          <w:highlight w:val="cyan"/>
-        </w:rPr>
-        <w:t>geneanet</w:t>
-      </w:r>
-      <w:proofErr w:type="spellEnd"/>
-      <w:r>
-        <w:rPr>
-          <w:rStyle w:val="n"/>
-          <w:rFonts w:eastAsiaTheme="majorEastAsia"/>
-          <w:highlight w:val="cyan"/>
-        </w:rPr>
         <w:t xml:space="preserve"> -a url="https://gw.geneanet.org/nraibaut2?lang=fr&amp;n=dupont&amp;oc=0&amp;p=gerard"</w:t>
       </w:r>
     </w:p>
-    <w:p/>
     <w:p>
       <w:pPr>
         <w:pStyle w:val="PrformatHTML"/>
@@ -599,81 +530,104 @@
       </w:r>
     </w:p>
     <w:p>
-      <w:pPr>
-        <w:autoSpaceDE w:val="0"/>
-        <w:autoSpaceDN w:val="0"/>
-        <w:adjustRightInd w:val="0"/>
-        <w:rPr>
-          <w:rFonts w:ascii="Lucida Console" w:hAnsi="Lucida Console" w:cs="Lucida Console"/>
-          <w:kern w:val="0"/>
-          <w:sz w:val="18"/>
-          <w:szCs w:val="18"/>
-        </w:rPr>
-      </w:pPr>
-      <w:proofErr w:type="spellStart"/>
-      <w:proofErr w:type="gramStart"/>
-      <w:r>
-        <w:rPr>
-          <w:rFonts w:ascii="Lucida Console" w:hAnsi="Lucida Console" w:cs="Lucida Console"/>
-          <w:kern w:val="0"/>
-          <w:sz w:val="18"/>
-          <w:szCs w:val="18"/>
-        </w:rPr>
+      <w:proofErr w:type="spellStart"/>
+      <w:proofErr w:type="gramStart"/>
+      <w:r>
         <w:t>egrep</w:t>
       </w:r>
       <w:proofErr w:type="spellEnd"/>
       <w:proofErr w:type="gramEnd"/>
       <w:r>
-        <w:rPr>
-          <w:rFonts w:ascii="Lucida Console" w:hAnsi="Lucida Console" w:cs="Lucida Console"/>
-          <w:kern w:val="0"/>
-          <w:sz w:val="18"/>
-          <w:szCs w:val="18"/>
-        </w:rPr>
         <w:t xml:space="preserve"> '</w:t>
       </w:r>
       <w:proofErr w:type="spellStart"/>
       <w:r>
-        <w:rPr>
-          <w:rFonts w:ascii="Lucida Console" w:hAnsi="Lucida Console" w:cs="Lucida Console"/>
-          <w:kern w:val="0"/>
-          <w:sz w:val="18"/>
-          <w:szCs w:val="18"/>
-        </w:rPr>
         <w:t>Traceback|ERROR</w:t>
       </w:r>
       <w:proofErr w:type="spellEnd"/>
       <w:r>
-        <w:rPr>
-          <w:rFonts w:ascii="Lucida Console" w:hAnsi="Lucida Console" w:cs="Lucida Console"/>
-          <w:kern w:val="0"/>
-          <w:sz w:val="18"/>
-          <w:szCs w:val="18"/>
-        </w:rPr>
         <w:t xml:space="preserve">' </w:t>
       </w:r>
       <w:proofErr w:type="spellStart"/>
       <w:r>
-        <w:rPr>
-          <w:rFonts w:ascii="Lucida Console" w:hAnsi="Lucida Console" w:cs="Lucida Console"/>
-          <w:kern w:val="0"/>
-          <w:sz w:val="18"/>
-          <w:szCs w:val="18"/>
-        </w:rPr>
         <w:t>result</w:t>
       </w:r>
       <w:proofErr w:type="spellEnd"/>
       <w:r>
-        <w:rPr>
-          <w:rFonts w:ascii="Lucida Console" w:hAnsi="Lucida Console" w:cs="Lucida Console"/>
-          <w:kern w:val="0"/>
-          <w:sz w:val="18"/>
-          <w:szCs w:val="18"/>
-        </w:rPr>
         <w:t>/*.log</w:t>
       </w:r>
     </w:p>
-    <w:p/>
+    <w:p>
+      <w:proofErr w:type="spellStart"/>
+      <w:proofErr w:type="gramStart"/>
+      <w:r>
+        <w:t>grep</w:t>
+      </w:r>
+      <w:proofErr w:type="spellEnd"/>
+      <w:proofErr w:type="gramEnd"/>
+      <w:r>
+        <w:t xml:space="preserve"> </w:t>
+      </w:r>
+      <w:r>
+        <w:t>@todo</w:t>
+      </w:r>
+      <w:r>
+        <w:t xml:space="preserve"> </w:t>
+      </w:r>
+      <w:proofErr w:type="spellStart"/>
+      <w:r>
+        <w:t>result</w:t>
+      </w:r>
+      <w:proofErr w:type="spellEnd"/>
+      <w:r>
+        <w:t>/*.</w:t>
+      </w:r>
+      <w:proofErr w:type="spellStart"/>
+      <w:r>
+        <w:t>ged</w:t>
+      </w:r>
+      <w:proofErr w:type="spellEnd"/>
+    </w:p>
+    <w:p>
+      <w:proofErr w:type="spellStart"/>
+      <w:proofErr w:type="gramStart"/>
+      <w:r>
+        <w:t>grep</w:t>
+      </w:r>
+      <w:proofErr w:type="spellEnd"/>
+      <w:proofErr w:type="gramEnd"/>
+      <w:r>
+        <w:t xml:space="preserve"> 'INFO: - ' </w:t>
+      </w:r>
+      <w:proofErr w:type="spellStart"/>
+      <w:r>
+        <w:t>result</w:t>
+      </w:r>
+      <w:proofErr w:type="spellEnd"/>
+      <w:r>
+        <w:t>/*.log</w:t>
+      </w:r>
+    </w:p>
+    <w:p>
+      <w:proofErr w:type="spellStart"/>
+      <w:proofErr w:type="gramStart"/>
+      <w:r>
+        <w:t>grep</w:t>
+      </w:r>
+      <w:proofErr w:type="spellEnd"/>
+      <w:proofErr w:type="gramEnd"/>
+      <w:r>
+        <w:t xml:space="preserve"> 'Anomalies détectées' </w:t>
+      </w:r>
+      <w:proofErr w:type="spellStart"/>
+      <w:r>
+        <w:t>result</w:t>
+      </w:r>
+      <w:proofErr w:type="spellEnd"/>
+      <w:r>
+        <w:t>/*.log</w:t>
+      </w:r>
+    </w:p>
     <w:p/>
     <w:p>
       <w:proofErr w:type="spellStart"/>
@@ -823,7 +777,6 @@
           <w:rFonts w:eastAsiaTheme="majorEastAsia"/>
           <w:highlight w:val="cyan"/>
         </w:rPr>
-        <w:lastRenderedPageBreak/>
         <w:t>scrapy</w:t>
       </w:r>
       <w:proofErr w:type="spellEnd"/>
@@ -15977,7 +15930,7 @@
       <w:rPr>
         <w:noProof/>
       </w:rPr>
-      <w:t>17/08/2023</w:t>
+      <w:t>18/08/2023</w:t>
     </w:r>
     <w:r>
       <w:fldChar w:fldCharType="end"/>

</xml_diff>

<commit_message>
Correctif familles, étape 2
</commit_message>
<xml_diff>
--- a/doc/NotesNRa4_tests.docx
+++ b/doc/NotesNRa4_tests.docx
@@ -628,6 +628,28 @@
         <w:t>/*.log</w:t>
       </w:r>
     </w:p>
+    <w:p>
+      <w:proofErr w:type="spellStart"/>
+      <w:proofErr w:type="gramStart"/>
+      <w:r>
+        <w:t>grep</w:t>
+      </w:r>
+      <w:proofErr w:type="spellEnd"/>
+      <w:proofErr w:type="gramEnd"/>
+      <w:r>
+        <w:t xml:space="preserve"> "enfants dans la famille" </w:t>
+      </w:r>
+      <w:proofErr w:type="spellStart"/>
+      <w:r>
+        <w:t>result</w:t>
+      </w:r>
+      <w:proofErr w:type="spellEnd"/>
+      <w:r>
+        <w:t>/*.log</w:t>
+      </w:r>
+    </w:p>
+    <w:p/>
+    <w:p/>
     <w:p/>
     <w:p>
       <w:proofErr w:type="spellStart"/>
@@ -15930,7 +15952,7 @@
       <w:rPr>
         <w:noProof/>
       </w:rPr>
-      <w:t>18/08/2023</w:t>
+      <w:t>20/08/2023</w:t>
     </w:r>
     <w:r>
       <w:fldChar w:fldCharType="end"/>

</xml_diff>